<commit_message>
Kérdez felelek rész késsz HTML, CSS részről
</commit_message>
<xml_diff>
--- a/FAQ.docx
+++ b/FAQ.docx
@@ -13,11 +13,12 @@
       </w:pPr>
       <w:r>
         <w:rPr>
-          <w:rFonts w:ascii="Times New Roman" w:hAnsi="Times New Roman" w:cs="Times New Roman"/>
+          <w:rFonts w:ascii="Times New Roman" w:hAnsi="Times New Roman" w:eastAsia="Aptos" w:cs="Times New Roman" w:eastAsiaTheme="minorHAnsi"/>
+          <w:kern w:val="2"/>
           <w:sz w:val="50"/>
           <w:szCs w:val="50"/>
         </w:rPr>
-        <w:t>FAQ</w:t>
+        <w:t>Kérdez felelek</w:t>
       </w:r>
     </w:p>
     <w:p>

</xml_diff>

<commit_message>
FAQ rész fellett töltve válaszokkal.
</commit_message>
<xml_diff>
--- a/FAQ.docx
+++ b/FAQ.docx
@@ -13,8 +13,7 @@
       </w:pPr>
       <w:r>
         <w:rPr>
-          <w:rFonts w:ascii="Times New Roman" w:hAnsi="Times New Roman" w:eastAsia="Aptos" w:cs="Times New Roman" w:eastAsiaTheme="minorHAnsi"/>
-          <w:kern w:val="2"/>
+          <w:rFonts w:ascii="Times New Roman" w:hAnsi="Times New Roman" w:cs="Times New Roman"/>
           <w:sz w:val="50"/>
           <w:szCs w:val="50"/>
         </w:rPr>
@@ -61,7 +60,7 @@
       </w:pPr>
       <w:r>
         <w:rPr>
-          <w:rFonts w:ascii="-webkit-standard" w:hAnsi="-webkit-standard"/>
+          <w:rFonts w:ascii="-webkit-standard" w:hAnsi="-webkit-standard" w:cs="-webkit-standard"/>
           <w:color w:val="000000"/>
           <w:sz w:val="27"/>
           <w:szCs w:val="27"/>
@@ -73,6 +72,30 @@
       <w:pPr>
         <w:pStyle w:val="Listaszerbekezds"/>
         <w:numPr>
+          <w:ilvl w:val="2"/>
+          <w:numId w:val="1"/>
+        </w:numPr>
+        <w:rPr>
+          <w:rFonts w:ascii="Times New Roman" w:hAnsi="Times New Roman" w:cs="Times New Roman"/>
+          <w:color w:val="000000"/>
+          <w:sz w:val="20"/>
+          <w:szCs w:val="20"/>
+        </w:rPr>
+      </w:pPr>
+      <w:r>
+        <w:rPr>
+          <w:rFonts w:ascii="Times New Roman" w:hAnsi="Times New Roman" w:cs="Times New Roman"/>
+          <w:color w:val="000000"/>
+          <w:sz w:val="20"/>
+          <w:szCs w:val="20"/>
+        </w:rPr>
+        <w:t>A foglalási időszak a fotózás típusától függ. Esküvők és nagyobb rendezvények esetében érdemes a nagy nap előtt 6–12 hónappal jelentkezni, mivel a tavaszi-nyári szezon hétvégéi hamar betelnek. Kisebb fotózások (például portré, sport vagy páros fotózás) esetén általában elegendő 2–4 héttel előre egyeztetnünk. Mindenképp azt javaslom, hogy amint megvan az elképzelésed, vedd fel velem a kapcsolatot, hogy biztosan találjunk megfelelő időpontot!</w:t>
+      </w:r>
+    </w:p>
+    <w:p>
+      <w:pPr>
+        <w:pStyle w:val="Listaszerbekezds"/>
+        <w:numPr>
           <w:ilvl w:val="1"/>
           <w:numId w:val="1"/>
         </w:numPr>
@@ -85,7 +108,7 @@
       </w:pPr>
       <w:r>
         <w:rPr>
-          <w:rFonts w:ascii="-webkit-standard" w:hAnsi="-webkit-standard"/>
+          <w:rFonts w:ascii="-webkit-standard" w:hAnsi="-webkit-standard" w:cs="-webkit-standard"/>
           <w:color w:val="000000"/>
           <w:sz w:val="27"/>
           <w:szCs w:val="27"/>
@@ -97,6 +120,30 @@
       <w:pPr>
         <w:pStyle w:val="Listaszerbekezds"/>
         <w:numPr>
+          <w:ilvl w:val="2"/>
+          <w:numId w:val="1"/>
+        </w:numPr>
+        <w:rPr>
+          <w:rFonts w:ascii="Times New Roman" w:hAnsi="Times New Roman" w:cs="Times New Roman"/>
+          <w:color w:val="000000"/>
+          <w:sz w:val="20"/>
+          <w:szCs w:val="20"/>
+        </w:rPr>
+      </w:pPr>
+      <w:r>
+        <w:rPr>
+          <w:rFonts w:ascii="Times New Roman" w:hAnsi="Times New Roman" w:cs="Times New Roman"/>
+          <w:color w:val="000000"/>
+          <w:sz w:val="20"/>
+          <w:szCs w:val="20"/>
+        </w:rPr>
+        <w:t>Igen, a naptáramban az időpontod a foglaló befizetésével (és nagyobb eseményeknél a megbízási szerződés elfogadásával) válik hivatalosan is véglegessé és garantálttá. A foglaló mértéke általában a végösszeg 20–30%-a, amely természetesen levonásra kerül a fotózás végső díjából. Amíg ez nem történik meg, az időpontot fenntartom, de más érdeklődő is lefoglalhatja.</w:t>
+      </w:r>
+    </w:p>
+    <w:p>
+      <w:pPr>
+        <w:pStyle w:val="Listaszerbekezds"/>
+        <w:numPr>
           <w:ilvl w:val="1"/>
           <w:numId w:val="1"/>
         </w:numPr>
@@ -109,7 +156,7 @@
       </w:pPr>
       <w:r>
         <w:rPr>
-          <w:rFonts w:ascii="-webkit-standard" w:hAnsi="-webkit-standard"/>
+          <w:rFonts w:ascii="-webkit-standard" w:hAnsi="-webkit-standard" w:cs="-webkit-standard"/>
           <w:color w:val="000000"/>
           <w:sz w:val="27"/>
           <w:szCs w:val="27"/>
@@ -121,6 +168,48 @@
       <w:pPr>
         <w:pStyle w:val="Listaszerbekezds"/>
         <w:numPr>
+          <w:ilvl w:val="2"/>
+          <w:numId w:val="1"/>
+        </w:numPr>
+        <w:rPr>
+          <w:rFonts w:ascii="Times New Roman" w:hAnsi="Times New Roman" w:cs="Times New Roman"/>
+          <w:color w:val="000000"/>
+          <w:sz w:val="20"/>
+          <w:szCs w:val="20"/>
+        </w:rPr>
+      </w:pPr>
+      <w:r>
+        <w:rPr>
+          <w:rFonts w:ascii="Times New Roman" w:hAnsi="Times New Roman" w:cs="Times New Roman"/>
+          <w:color w:val="000000"/>
+          <w:sz w:val="20"/>
+          <w:szCs w:val="20"/>
+        </w:rPr>
+        <w:t>T</w:t>
+      </w:r>
+      <w:r>
+        <w:rPr>
+          <w:rFonts w:ascii="Times New Roman" w:hAnsi="Times New Roman" w:cs="Times New Roman"/>
+          <w:color w:val="000000"/>
+          <w:sz w:val="20"/>
+          <w:szCs w:val="20"/>
+        </w:rPr>
+        <w:t>udom, hogy az életben bármikor közbejöhet valami váratlan (például betegség, vagy szabadtéri fotózásnál a rossz időjárás). Ilyen esetekben rugalmas vagyok: lehetőség van az időpont egyszeri, díjmentes módosítására, amennyiben azt a fotózás előtt legalább 48 órával jelzed nekem. Végleges lemondás, vagy az utolsó pillanatban történő módosítás esetén azonban a foglaló visszafizetésére sajnos nincs mód, hiszen azt az időpontot másnak már nem tudom kiadni</w:t>
+      </w:r>
+      <w:r>
+        <w:rPr>
+          <w:rFonts w:ascii="Times New Roman" w:hAnsi="Times New Roman" w:cs="Times New Roman"/>
+          <w:color w:val="000000"/>
+          <w:sz w:val="20"/>
+          <w:szCs w:val="20"/>
+        </w:rPr>
+        <w:t>.</w:t>
+      </w:r>
+    </w:p>
+    <w:p>
+      <w:pPr>
+        <w:pStyle w:val="Listaszerbekezds"/>
+        <w:numPr>
           <w:ilvl w:val="1"/>
           <w:numId w:val="1"/>
         </w:numPr>
@@ -133,7 +222,7 @@
       </w:pPr>
       <w:r>
         <w:rPr>
-          <w:rFonts w:ascii="-webkit-standard" w:hAnsi="-webkit-standard"/>
+          <w:rFonts w:ascii="-webkit-standard" w:hAnsi="-webkit-standard" w:cs="-webkit-standard"/>
           <w:color w:val="000000"/>
           <w:sz w:val="27"/>
           <w:szCs w:val="27"/>
@@ -145,6 +234,30 @@
       <w:pPr>
         <w:pStyle w:val="Listaszerbekezds"/>
         <w:numPr>
+          <w:ilvl w:val="2"/>
+          <w:numId w:val="1"/>
+        </w:numPr>
+        <w:rPr>
+          <w:rFonts w:ascii="Times New Roman" w:hAnsi="Times New Roman" w:cs="Times New Roman"/>
+          <w:color w:val="000000"/>
+          <w:sz w:val="20"/>
+          <w:szCs w:val="20"/>
+        </w:rPr>
+      </w:pPr>
+      <w:r>
+        <w:rPr>
+          <w:rFonts w:ascii="Times New Roman" w:hAnsi="Times New Roman" w:cs="Times New Roman"/>
+          <w:color w:val="000000"/>
+          <w:sz w:val="20"/>
+          <w:szCs w:val="20"/>
+        </w:rPr>
+        <w:t>A fennmaradó összeg kiegyenlítésére készpénzben a fotózás napján, vagy banki átutalással van lehetőség (legkésőbb a kész, kidolgozott képek átadásáig). Természetesen minden munkámról számlát állítok ki, így cégek és vállalkozások részére a céges átutalás is zökkenőmentesen megoldható.</w:t>
+      </w:r>
+    </w:p>
+    <w:p>
+      <w:pPr>
+        <w:pStyle w:val="Listaszerbekezds"/>
+        <w:numPr>
           <w:ilvl w:val="0"/>
           <w:numId w:val="1"/>
         </w:numPr>
@@ -181,7 +294,7 @@
       </w:pPr>
       <w:r>
         <w:rPr>
-          <w:rFonts w:ascii="-webkit-standard" w:hAnsi="-webkit-standard"/>
+          <w:rFonts w:ascii="-webkit-standard" w:hAnsi="-webkit-standard" w:cs="-webkit-standard"/>
           <w:color w:val="000000"/>
           <w:sz w:val="27"/>
           <w:szCs w:val="27"/>
@@ -193,6 +306,30 @@
       <w:pPr>
         <w:pStyle w:val="Listaszerbekezds"/>
         <w:numPr>
+          <w:ilvl w:val="2"/>
+          <w:numId w:val="1"/>
+        </w:numPr>
+        <w:rPr>
+          <w:rFonts w:ascii="Times New Roman" w:hAnsi="Times New Roman" w:cs="Times New Roman"/>
+          <w:color w:val="000000"/>
+          <w:sz w:val="20"/>
+          <w:szCs w:val="20"/>
+        </w:rPr>
+      </w:pPr>
+      <w:r>
+        <w:rPr>
+          <w:rFonts w:ascii="Times New Roman" w:hAnsi="Times New Roman" w:cs="Times New Roman"/>
+          <w:color w:val="000000"/>
+          <w:sz w:val="20"/>
+          <w:szCs w:val="20"/>
+        </w:rPr>
+        <w:t>A legfontosabb, hogy kényelmesen érezzétek magatokat abban, amit viseltek! Érdemes kerülni a hatalmas, feltűnő logókat, a neon színeket és a túlzottan sűrű, apró mintákat, mert ezek elvonják a figyelmet az arcotokról. Páros vagy családi fotózásnál nem kell teljesen egyformába öltözni; sokkal szebb a végeredmény, ha 2-3 egymással harmonizáló színt (például földszíneket, pasztell árnyalatokat) választotok. Ha bizonytalanok vagytok, a fotózás előtt szívesen segítek a ruhák összehangolásában!</w:t>
+      </w:r>
+    </w:p>
+    <w:p>
+      <w:pPr>
+        <w:pStyle w:val="Listaszerbekezds"/>
+        <w:numPr>
           <w:ilvl w:val="1"/>
           <w:numId w:val="1"/>
         </w:numPr>
@@ -205,7 +342,7 @@
       </w:pPr>
       <w:r>
         <w:rPr>
-          <w:rFonts w:ascii="-webkit-standard" w:hAnsi="-webkit-standard"/>
+          <w:rFonts w:ascii="-webkit-standard" w:hAnsi="-webkit-standard" w:cs="-webkit-standard"/>
           <w:color w:val="000000"/>
           <w:sz w:val="27"/>
           <w:szCs w:val="27"/>
@@ -217,6 +354,50 @@
       <w:pPr>
         <w:pStyle w:val="Listaszerbekezds"/>
         <w:numPr>
+          <w:ilvl w:val="2"/>
+          <w:numId w:val="1"/>
+        </w:numPr>
+        <w:rPr>
+          <w:rFonts w:ascii="Times New Roman" w:hAnsi="Times New Roman" w:cs="Times New Roman"/>
+          <w:color w:val="000000"/>
+          <w:sz w:val="20"/>
+          <w:szCs w:val="20"/>
+        </w:rPr>
+      </w:pPr>
+      <w:r>
+        <w:rPr>
+          <w:rFonts w:ascii="Times New Roman" w:hAnsi="Times New Roman" w:cs="Times New Roman"/>
+          <w:color w:val="000000"/>
+          <w:sz w:val="20"/>
+          <w:szCs w:val="20"/>
+        </w:rPr>
+        <w:t xml:space="preserve">Ezzel a vendégeim 90%-a így van az első percekben, úgyhogy egyáltalán nem kell izgulnotok! Az én feladatom, hogy feloldjam a feszültséget és végig vezesselek titeket a folyamaton. Nem kőmerev, </w:t>
+      </w:r>
+      <w:proofErr w:type="spellStart"/>
+      <w:r>
+        <w:rPr>
+          <w:rFonts w:ascii="Times New Roman" w:hAnsi="Times New Roman" w:cs="Times New Roman"/>
+          <w:color w:val="000000"/>
+          <w:sz w:val="20"/>
+          <w:szCs w:val="20"/>
+        </w:rPr>
+        <w:t>feszengős</w:t>
+      </w:r>
+      <w:proofErr w:type="spellEnd"/>
+      <w:r>
+        <w:rPr>
+          <w:rFonts w:ascii="Times New Roman" w:hAnsi="Times New Roman" w:cs="Times New Roman"/>
+          <w:color w:val="000000"/>
+          <w:sz w:val="20"/>
+          <w:szCs w:val="20"/>
+        </w:rPr>
+        <w:t xml:space="preserve"> pózokat fogunk erőltetni, hanem apró instrukciókat, játékos feladatokat adok (például sétáljatok egymás felé, vagy mondjatok valami vicceset a másiknak). Így valódi, őszinte pillanatokat és természetes mosolyokat tudok megörökíteni. Olyan lesz, mint egy laza séta, amit a végén még élvezni is fogtok!</w:t>
+      </w:r>
+    </w:p>
+    <w:p>
+      <w:pPr>
+        <w:pStyle w:val="Listaszerbekezds"/>
+        <w:numPr>
           <w:ilvl w:val="1"/>
           <w:numId w:val="1"/>
         </w:numPr>
@@ -229,7 +410,7 @@
       </w:pPr>
       <w:r>
         <w:rPr>
-          <w:rFonts w:ascii="-webkit-standard" w:hAnsi="-webkit-standard"/>
+          <w:rFonts w:ascii="-webkit-standard" w:hAnsi="-webkit-standard" w:cs="-webkit-standard"/>
           <w:color w:val="000000"/>
           <w:sz w:val="27"/>
           <w:szCs w:val="27"/>
@@ -241,6 +422,40 @@
       <w:pPr>
         <w:pStyle w:val="Listaszerbekezds"/>
         <w:numPr>
+          <w:ilvl w:val="2"/>
+          <w:numId w:val="1"/>
+        </w:numPr>
+        <w:rPr>
+          <w:rFonts w:ascii="Times New Roman" w:hAnsi="Times New Roman" w:cs="Times New Roman"/>
+          <w:color w:val="000000"/>
+          <w:sz w:val="20"/>
+          <w:szCs w:val="20"/>
+        </w:rPr>
+      </w:pPr>
+      <w:r>
+        <w:rPr>
+          <w:rFonts w:ascii="Times New Roman" w:hAnsi="Times New Roman" w:cs="Times New Roman"/>
+          <w:color w:val="000000"/>
+          <w:sz w:val="20"/>
+          <w:szCs w:val="20"/>
+        </w:rPr>
+        <w:t xml:space="preserve">Az időjárás az egyetlen, amit nem tudunk irányítani, de mindig van egy "B" tervünk. A fotózás előtti napokban folyamatosan figyeljük az előrejelzést. Ha tartós eső vagy </w:t>
+      </w:r>
+      <w:r>
+        <w:rPr>
+          <w:rFonts w:ascii="Times New Roman" w:hAnsi="Times New Roman" w:cs="Times New Roman"/>
+          <w:color w:val="000000"/>
+          <w:sz w:val="20"/>
+          <w:szCs w:val="20"/>
+        </w:rPr>
+        <w:lastRenderedPageBreak/>
+        <w:t>vihar várható, természetesen rugalmasan és díjmentesen keresünk egy új, mindkettőnknek megfelelő időpontot. Ha az időpont nem csúsztatható, alternatív megoldásként átszervezhetjük a fotózást egy szép, bérelt napfény-stúdióba vagy más fedett, izgalmas helyszínre.</w:t>
+      </w:r>
+    </w:p>
+    <w:p>
+      <w:pPr>
+        <w:pStyle w:val="Listaszerbekezds"/>
+        <w:numPr>
           <w:ilvl w:val="1"/>
           <w:numId w:val="1"/>
         </w:numPr>
@@ -253,7 +468,7 @@
       </w:pPr>
       <w:r>
         <w:rPr>
-          <w:rFonts w:ascii="-webkit-standard" w:hAnsi="-webkit-standard"/>
+          <w:rFonts w:ascii="-webkit-standard" w:hAnsi="-webkit-standard" w:cs="-webkit-standard"/>
           <w:color w:val="000000"/>
           <w:sz w:val="27"/>
           <w:szCs w:val="27"/>
@@ -265,6 +480,30 @@
       <w:pPr>
         <w:pStyle w:val="Listaszerbekezds"/>
         <w:numPr>
+          <w:ilvl w:val="2"/>
+          <w:numId w:val="1"/>
+        </w:numPr>
+        <w:rPr>
+          <w:rFonts w:ascii="Times New Roman" w:hAnsi="Times New Roman" w:cs="Times New Roman"/>
+          <w:color w:val="000000"/>
+          <w:sz w:val="20"/>
+          <w:szCs w:val="20"/>
+        </w:rPr>
+      </w:pPr>
+      <w:r>
+        <w:rPr>
+          <w:rFonts w:ascii="Times New Roman" w:hAnsi="Times New Roman" w:cs="Times New Roman"/>
+          <w:color w:val="000000"/>
+          <w:sz w:val="20"/>
+          <w:szCs w:val="20"/>
+        </w:rPr>
+        <w:t>Abszolút, sőt, kifejezetten ajánlom! Bármilyen személyes kiegészítő (egy kedvenc kalap, egy hangszer, vagy egy számotokra fontos tárgy) sokkal egyedibbé és "sajátotokká" teszi a fotókat. A házi kedvencek szintén hatalmas pluszt adnak az élményhez, így szabadtéri (vagy állatbarát stúdiós) fotózásra bátran elhozhatjátok őket. Annyit kérek csak, hogy ezt előre jelezzétek nekem, és érdemes egy kísérőt is magatokkal hozni, aki figyel a kutyusra/cicára abban a pár percben, amikor csak rólatok készülnek a képek.</w:t>
+      </w:r>
+    </w:p>
+    <w:p>
+      <w:pPr>
+        <w:pStyle w:val="Listaszerbekezds"/>
+        <w:numPr>
           <w:ilvl w:val="0"/>
           <w:numId w:val="1"/>
         </w:numPr>
@@ -301,7 +540,7 @@
       </w:pPr>
       <w:r>
         <w:rPr>
-          <w:rFonts w:ascii="-webkit-standard" w:hAnsi="-webkit-standard"/>
+          <w:rFonts w:ascii="-webkit-standard" w:hAnsi="-webkit-standard" w:cs="-webkit-standard"/>
           <w:color w:val="000000"/>
           <w:sz w:val="27"/>
           <w:szCs w:val="27"/>
@@ -313,6 +552,50 @@
       <w:pPr>
         <w:pStyle w:val="Listaszerbekezds"/>
         <w:numPr>
+          <w:ilvl w:val="2"/>
+          <w:numId w:val="1"/>
+        </w:numPr>
+        <w:rPr>
+          <w:rFonts w:ascii="Times New Roman" w:hAnsi="Times New Roman" w:cs="Times New Roman"/>
+          <w:color w:val="000000"/>
+          <w:sz w:val="20"/>
+          <w:szCs w:val="20"/>
+        </w:rPr>
+      </w:pPr>
+      <w:r>
+        <w:rPr>
+          <w:rFonts w:ascii="Times New Roman" w:hAnsi="Times New Roman" w:cs="Times New Roman"/>
+          <w:color w:val="000000"/>
+          <w:sz w:val="20"/>
+          <w:szCs w:val="20"/>
+        </w:rPr>
+        <w:t xml:space="preserve">A kidolgozott, átadott képek száma az általad választott fotózási csomagtól és a fotózás típusától függ. Egy rövidebb portré- vagy páros fotózás esetén általában 15–30 gondosan </w:t>
+      </w:r>
+      <w:proofErr w:type="spellStart"/>
+      <w:r>
+        <w:rPr>
+          <w:rFonts w:ascii="Times New Roman" w:hAnsi="Times New Roman" w:cs="Times New Roman"/>
+          <w:color w:val="000000"/>
+          <w:sz w:val="20"/>
+          <w:szCs w:val="20"/>
+        </w:rPr>
+        <w:t>utómunkázott</w:t>
+      </w:r>
+      <w:proofErr w:type="spellEnd"/>
+      <w:r>
+        <w:rPr>
+          <w:rFonts w:ascii="Times New Roman" w:hAnsi="Times New Roman" w:cs="Times New Roman"/>
+          <w:color w:val="000000"/>
+          <w:sz w:val="20"/>
+          <w:szCs w:val="20"/>
+        </w:rPr>
+        <w:t xml:space="preserve"> képet adok át, míg egy egész napos esküvő vagy nagyobb rendezvény esetében ez a szám 300–600 kép is lehet. A konkrét ajánlatban minden esetben pontosan feltüntetem a garantált képszámot, de ha egy fotózáson több zseniális, megismételhetetlen pillanat születik, azokat sem szoktam visszatartani!</w:t>
+      </w:r>
+    </w:p>
+    <w:p>
+      <w:pPr>
+        <w:pStyle w:val="Listaszerbekezds"/>
+        <w:numPr>
           <w:ilvl w:val="1"/>
           <w:numId w:val="1"/>
         </w:numPr>
@@ -325,7 +608,7 @@
       </w:pPr>
       <w:r>
         <w:rPr>
-          <w:rFonts w:ascii="-webkit-standard" w:hAnsi="-webkit-standard"/>
+          <w:rFonts w:ascii="-webkit-standard" w:hAnsi="-webkit-standard" w:cs="-webkit-standard"/>
           <w:color w:val="000000"/>
           <w:sz w:val="27"/>
           <w:szCs w:val="27"/>
@@ -337,6 +620,50 @@
       <w:pPr>
         <w:pStyle w:val="Listaszerbekezds"/>
         <w:numPr>
+          <w:ilvl w:val="2"/>
+          <w:numId w:val="1"/>
+        </w:numPr>
+        <w:rPr>
+          <w:rFonts w:ascii="Times New Roman" w:hAnsi="Times New Roman" w:cs="Times New Roman"/>
+          <w:color w:val="000000"/>
+          <w:sz w:val="20"/>
+          <w:szCs w:val="20"/>
+        </w:rPr>
+      </w:pPr>
+      <w:r>
+        <w:rPr>
+          <w:rFonts w:ascii="Times New Roman" w:hAnsi="Times New Roman" w:cs="Times New Roman"/>
+          <w:color w:val="000000"/>
+          <w:sz w:val="20"/>
+          <w:szCs w:val="20"/>
+        </w:rPr>
+        <w:t xml:space="preserve">A minőségi utómunka időt igényel, hiszen minden egyes átadott fotót egyenként szerkesztek és </w:t>
+      </w:r>
+      <w:proofErr w:type="spellStart"/>
+      <w:r>
+        <w:rPr>
+          <w:rFonts w:ascii="Times New Roman" w:hAnsi="Times New Roman" w:cs="Times New Roman"/>
+          <w:color w:val="000000"/>
+          <w:sz w:val="20"/>
+          <w:szCs w:val="20"/>
+        </w:rPr>
+        <w:t>finomhangolok</w:t>
+      </w:r>
+      <w:proofErr w:type="spellEnd"/>
+      <w:r>
+        <w:rPr>
+          <w:rFonts w:ascii="Times New Roman" w:hAnsi="Times New Roman" w:cs="Times New Roman"/>
+          <w:color w:val="000000"/>
+          <w:sz w:val="20"/>
+          <w:szCs w:val="20"/>
+        </w:rPr>
+        <w:t>, hogy a végeredmény tökéletes legyen. Kisebb fotózások (portré, sport, páros) esetén a kész anyagot általában 1–2 héten belül átadom. Nagyobb eseményeknél és esküvőknél a vállalási határidő – a szezon sűrűségétől függően – 4–6 hét szokott lenni. Természetesen esküvők és nagyobb rendezvények után igyekszem néhány napon belül küldeni egy kis ízelítőt a legjobb pillanatokból!</w:t>
+      </w:r>
+    </w:p>
+    <w:p>
+      <w:pPr>
+        <w:pStyle w:val="Listaszerbekezds"/>
+        <w:numPr>
           <w:ilvl w:val="1"/>
           <w:numId w:val="1"/>
         </w:numPr>
@@ -349,7 +676,7 @@
       </w:pPr>
       <w:r>
         <w:rPr>
-          <w:rFonts w:ascii="-webkit-standard" w:hAnsi="-webkit-standard"/>
+          <w:rFonts w:ascii="-webkit-standard" w:hAnsi="-webkit-standard" w:cs="-webkit-standard"/>
           <w:color w:val="000000"/>
           <w:sz w:val="27"/>
           <w:szCs w:val="27"/>
@@ -361,6 +688,50 @@
       <w:pPr>
         <w:pStyle w:val="Listaszerbekezds"/>
         <w:numPr>
+          <w:ilvl w:val="2"/>
+          <w:numId w:val="1"/>
+        </w:numPr>
+        <w:rPr>
+          <w:rFonts w:ascii="Times New Roman" w:hAnsi="Times New Roman" w:cs="Times New Roman"/>
+          <w:color w:val="000000"/>
+          <w:sz w:val="20"/>
+          <w:szCs w:val="20"/>
+        </w:rPr>
+      </w:pPr>
+      <w:r>
+        <w:rPr>
+          <w:rFonts w:ascii="Times New Roman" w:hAnsi="Times New Roman" w:cs="Times New Roman"/>
+          <w:color w:val="000000"/>
+          <w:sz w:val="20"/>
+          <w:szCs w:val="20"/>
+        </w:rPr>
+        <w:t>Nem, nyers (RAW) és retusálatlan képeket semmilyen esetben sem adok át. A fotózás csak a munka egyik fele; a végső, rám jellemző színvilágot, hangulatot és stílust a gondos utómunka (</w:t>
+      </w:r>
+      <w:proofErr w:type="spellStart"/>
+      <w:r>
+        <w:rPr>
+          <w:rFonts w:ascii="Times New Roman" w:hAnsi="Times New Roman" w:cs="Times New Roman"/>
+          <w:color w:val="000000"/>
+          <w:sz w:val="20"/>
+          <w:szCs w:val="20"/>
+        </w:rPr>
+        <w:t>fényelés</w:t>
+      </w:r>
+      <w:proofErr w:type="spellEnd"/>
+      <w:r>
+        <w:rPr>
+          <w:rFonts w:ascii="Times New Roman" w:hAnsi="Times New Roman" w:cs="Times New Roman"/>
+          <w:color w:val="000000"/>
+          <w:sz w:val="20"/>
+          <w:szCs w:val="20"/>
+        </w:rPr>
+        <w:t>, színkorrekció, retusálás) adja meg. Egy nyers fájl olyan, mint egy séfnek a nyers alapanyag a nevemhez és a portfóliómhoz pedig csak a maximális minőségű, teljesen "készre főzött" vizuális élmény társulhat. Bízom benne, hogy pont az eddigi kidolgozott képeim stílusa miatt választottál engem!</w:t>
+      </w:r>
+    </w:p>
+    <w:p>
+      <w:pPr>
+        <w:pStyle w:val="Listaszerbekezds"/>
+        <w:numPr>
           <w:ilvl w:val="1"/>
           <w:numId w:val="1"/>
         </w:numPr>
@@ -373,7 +744,7 @@
       </w:pPr>
       <w:r>
         <w:rPr>
-          <w:rFonts w:ascii="-webkit-standard" w:hAnsi="-webkit-standard"/>
+          <w:rFonts w:ascii="-webkit-standard" w:hAnsi="-webkit-standard" w:cs="-webkit-standard"/>
           <w:color w:val="000000"/>
           <w:sz w:val="27"/>
           <w:szCs w:val="27"/>
@@ -385,6 +756,84 @@
       <w:pPr>
         <w:pStyle w:val="Listaszerbekezds"/>
         <w:numPr>
+          <w:ilvl w:val="2"/>
+          <w:numId w:val="1"/>
+        </w:numPr>
+        <w:rPr>
+          <w:rFonts w:ascii="Times New Roman" w:hAnsi="Times New Roman" w:cs="Times New Roman"/>
+          <w:color w:val="000000"/>
+          <w:sz w:val="20"/>
+          <w:szCs w:val="20"/>
+        </w:rPr>
+      </w:pPr>
+      <w:r>
+        <w:rPr>
+          <w:rFonts w:ascii="Times New Roman" w:hAnsi="Times New Roman" w:cs="Times New Roman"/>
+          <w:color w:val="000000"/>
+          <w:sz w:val="20"/>
+          <w:szCs w:val="20"/>
+        </w:rPr>
+        <w:t xml:space="preserve">A kész, </w:t>
+      </w:r>
+      <w:proofErr w:type="spellStart"/>
+      <w:r>
+        <w:rPr>
+          <w:rFonts w:ascii="Times New Roman" w:hAnsi="Times New Roman" w:cs="Times New Roman"/>
+          <w:color w:val="000000"/>
+          <w:sz w:val="20"/>
+          <w:szCs w:val="20"/>
+        </w:rPr>
+        <w:t>utómunkázott</w:t>
+      </w:r>
+      <w:proofErr w:type="spellEnd"/>
+      <w:r>
+        <w:rPr>
+          <w:rFonts w:ascii="Times New Roman" w:hAnsi="Times New Roman" w:cs="Times New Roman"/>
+          <w:color w:val="000000"/>
+          <w:sz w:val="20"/>
+          <w:szCs w:val="20"/>
+        </w:rPr>
+        <w:t xml:space="preserve"> képeket nagy felbontású, nyomdai minőségű, vízjel nélküli</w:t>
+      </w:r>
+      <w:r>
+        <w:rPr>
+          <w:rFonts w:ascii="Times New Roman" w:hAnsi="Times New Roman" w:cs="Times New Roman"/>
+          <w:sz w:val="20"/>
+          <w:szCs w:val="20"/>
+        </w:rPr>
+        <w:t> </w:t>
+      </w:r>
+      <w:r>
+        <w:rPr>
+          <w:rFonts w:ascii="Times New Roman" w:hAnsi="Times New Roman" w:cs="Times New Roman"/>
+          <w:color w:val="000000"/>
+          <w:sz w:val="20"/>
+          <w:szCs w:val="20"/>
+        </w:rPr>
+        <w:t>JPEG</w:t>
+      </w:r>
+      <w:r>
+        <w:rPr>
+          <w:rFonts w:ascii="Times New Roman" w:hAnsi="Times New Roman" w:cs="Times New Roman"/>
+          <w:sz w:val="20"/>
+          <w:szCs w:val="20"/>
+        </w:rPr>
+        <w:t> </w:t>
+      </w:r>
+      <w:r>
+        <w:rPr>
+          <w:rFonts w:ascii="Times New Roman" w:hAnsi="Times New Roman" w:cs="Times New Roman"/>
+          <w:color w:val="000000"/>
+          <w:sz w:val="20"/>
+          <w:szCs w:val="20"/>
+        </w:rPr>
+        <w:t>formátumban adom át. A képek letöltéséhez egy elegáns, privát online galériát hozok létre nektek. Ezt a linket könnyedén megoszthatjátok a családdal és a barátokkal is, és kényelmesen le tudjátok tölteni róla a képeket számítógépre vagy telefonra anélkül, hogy a minőségük romlana (mint ahogy az a Messengeren vagy Facebookon történne).</w:t>
+      </w:r>
+    </w:p>
+    <w:p>
+      <w:pPr>
+        <w:pStyle w:val="Listaszerbekezds"/>
+        <w:numPr>
           <w:ilvl w:val="0"/>
           <w:numId w:val="1"/>
         </w:numPr>
@@ -419,7 +868,7 @@
       </w:pPr>
       <w:r>
         <w:rPr>
-          <w:rFonts w:ascii="-webkit-standard" w:hAnsi="-webkit-standard"/>
+          <w:rFonts w:ascii="-webkit-standard" w:hAnsi="-webkit-standard" w:cs="-webkit-standard"/>
           <w:color w:val="000000"/>
           <w:sz w:val="27"/>
           <w:szCs w:val="27"/>
@@ -431,6 +880,64 @@
       <w:pPr>
         <w:pStyle w:val="Listaszerbekezds"/>
         <w:numPr>
+          <w:ilvl w:val="2"/>
+          <w:numId w:val="1"/>
+        </w:numPr>
+        <w:rPr>
+          <w:rFonts w:ascii="Times New Roman" w:hAnsi="Times New Roman" w:cs="Times New Roman"/>
+          <w:color w:val="000000"/>
+          <w:sz w:val="20"/>
+          <w:szCs w:val="20"/>
+        </w:rPr>
+      </w:pPr>
+      <w:r>
+        <w:rPr>
+          <w:rFonts w:ascii="Times New Roman" w:hAnsi="Times New Roman" w:cs="Times New Roman"/>
+          <w:color w:val="000000"/>
+          <w:sz w:val="20"/>
+          <w:szCs w:val="20"/>
+        </w:rPr>
+        <w:t>Természetesen, sőt, kifejezetten szeretek új helyszíneket és izgalmas környezeteket felfedezni! Bár a bázisom</w:t>
+      </w:r>
+      <w:r>
+        <w:rPr>
+          <w:rFonts w:ascii="Times New Roman" w:hAnsi="Times New Roman" w:cs="Times New Roman"/>
+          <w:sz w:val="20"/>
+          <w:szCs w:val="20"/>
+        </w:rPr>
+        <w:t> </w:t>
+      </w:r>
+      <w:r>
+        <w:rPr>
+          <w:rFonts w:ascii="Times New Roman" w:hAnsi="Times New Roman" w:cs="Times New Roman"/>
+          <w:color w:val="000000"/>
+          <w:sz w:val="20"/>
+          <w:szCs w:val="20"/>
+        </w:rPr>
+        <w:t>Budapesten</w:t>
+      </w:r>
+      <w:r>
+        <w:rPr>
+          <w:rFonts w:ascii="Times New Roman" w:hAnsi="Times New Roman" w:cs="Times New Roman"/>
+          <w:sz w:val="20"/>
+          <w:szCs w:val="20"/>
+        </w:rPr>
+        <w:t> </w:t>
+      </w:r>
+      <w:r>
+        <w:rPr>
+          <w:rFonts w:ascii="Times New Roman" w:hAnsi="Times New Roman" w:cs="Times New Roman"/>
+          <w:color w:val="000000"/>
+          <w:sz w:val="20"/>
+          <w:szCs w:val="20"/>
+        </w:rPr>
+        <w:t>található, az ország bármely pontjára, sőt külföldi helyszínekre is örömmel utazom, legyen szó esküvőről, sporteseményről vagy egy különleges portréfotózásról.</w:t>
+      </w:r>
+    </w:p>
+    <w:p>
+      <w:pPr>
+        <w:pStyle w:val="Listaszerbekezds"/>
+        <w:numPr>
           <w:ilvl w:val="1"/>
           <w:numId w:val="1"/>
         </w:numPr>
@@ -442,12 +949,83 @@
       </w:pPr>
       <w:r>
         <w:rPr>
-          <w:rFonts w:ascii="-webkit-standard" w:hAnsi="-webkit-standard"/>
+          <w:rFonts w:ascii="-webkit-standard" w:hAnsi="-webkit-standard" w:cs="-webkit-standard"/>
           <w:color w:val="000000"/>
           <w:sz w:val="27"/>
           <w:szCs w:val="27"/>
         </w:rPr>
+        <w:lastRenderedPageBreak/>
         <w:t>Hogyan alakulnak az utazási és szállásköltségek?</w:t>
+      </w:r>
+    </w:p>
+    <w:p>
+      <w:pPr>
+        <w:pStyle w:val="Listaszerbekezds"/>
+        <w:numPr>
+          <w:ilvl w:val="2"/>
+          <w:numId w:val="1"/>
+        </w:numPr>
+        <w:rPr>
+          <w:rFonts w:ascii="Times New Roman" w:hAnsi="Times New Roman" w:cs="Times New Roman"/>
+          <w:color w:val="000000"/>
+          <w:sz w:val="20"/>
+          <w:szCs w:val="20"/>
+        </w:rPr>
+      </w:pPr>
+      <w:r>
+        <w:rPr>
+          <w:rFonts w:ascii="Times New Roman" w:hAnsi="Times New Roman" w:cs="Times New Roman"/>
+          <w:color w:val="000000"/>
+          <w:sz w:val="20"/>
+          <w:szCs w:val="20"/>
+        </w:rPr>
+        <w:t>Az árajánlat minden esetben egyedi, és a kiszállási díjat a fotózás helyszíne alapján előre, teljesen transzparensen egyeztetjük.</w:t>
+      </w:r>
+      <w:r>
+        <w:rPr>
+          <w:rFonts w:ascii="Times New Roman" w:hAnsi="Times New Roman" w:cs="Times New Roman"/>
+          <w:sz w:val="20"/>
+          <w:szCs w:val="20"/>
+        </w:rPr>
+        <w:t> </w:t>
+      </w:r>
+      <w:r>
+        <w:rPr>
+          <w:rFonts w:ascii="Times New Roman" w:hAnsi="Times New Roman" w:cs="Times New Roman"/>
+          <w:color w:val="000000"/>
+          <w:sz w:val="20"/>
+          <w:szCs w:val="20"/>
+        </w:rPr>
+        <w:t xml:space="preserve">Szarvas </w:t>
+      </w:r>
+      <w:r>
+        <w:rPr>
+          <w:rFonts w:ascii="Times New Roman" w:hAnsi="Times New Roman" w:cs="Times New Roman"/>
+          <w:color w:val="000000"/>
+          <w:sz w:val="20"/>
+          <w:szCs w:val="20"/>
+        </w:rPr>
+        <w:t xml:space="preserve">vonzáskörzetében a kiszállás általában díjmentes. Távolabbi helyszínek esetén egy korrekt, kilométer alapú útiköltséggel érdemes számolni. Szállásköltség csak </w:t>
+      </w:r>
+      <w:proofErr w:type="gramStart"/>
+      <w:r>
+        <w:rPr>
+          <w:rFonts w:ascii="Times New Roman" w:hAnsi="Times New Roman" w:cs="Times New Roman"/>
+          <w:color w:val="000000"/>
+          <w:sz w:val="20"/>
+          <w:szCs w:val="20"/>
+        </w:rPr>
+        <w:t>kivételes esetekben</w:t>
+      </w:r>
+      <w:proofErr w:type="gramEnd"/>
+      <w:r>
+        <w:rPr>
+          <w:rFonts w:ascii="Times New Roman" w:hAnsi="Times New Roman" w:cs="Times New Roman"/>
+          <w:color w:val="000000"/>
+          <w:sz w:val="20"/>
+          <w:szCs w:val="20"/>
+        </w:rPr>
+        <w:t xml:space="preserve"> merül fel, ha a helyszín nagyon távol esik, és a fotózás (például egy esküvő) késő éjszakába vagy hajnalba nyúlik, esetleg több napos rendezvényről van szó.</w:t>
       </w:r>
     </w:p>
     <w:p>
@@ -465,7 +1043,7 @@
       </w:pPr>
       <w:r>
         <w:rPr>
-          <w:rFonts w:ascii="-webkit-standard" w:hAnsi="-webkit-standard"/>
+          <w:rFonts w:ascii="-webkit-standard" w:hAnsi="-webkit-standard" w:cs="-webkit-standard"/>
           <w:color w:val="000000"/>
           <w:sz w:val="27"/>
           <w:szCs w:val="27"/>
@@ -477,6 +1055,30 @@
       <w:pPr>
         <w:pStyle w:val="Listaszerbekezds"/>
         <w:numPr>
+          <w:ilvl w:val="2"/>
+          <w:numId w:val="1"/>
+        </w:numPr>
+        <w:rPr>
+          <w:rFonts w:ascii="Times New Roman" w:hAnsi="Times New Roman" w:cs="Times New Roman"/>
+          <w:color w:val="000000"/>
+          <w:sz w:val="20"/>
+          <w:szCs w:val="20"/>
+        </w:rPr>
+      </w:pPr>
+      <w:r>
+        <w:rPr>
+          <w:rFonts w:ascii="Times New Roman" w:hAnsi="Times New Roman" w:cs="Times New Roman"/>
+          <w:color w:val="000000"/>
+          <w:sz w:val="20"/>
+          <w:szCs w:val="20"/>
+        </w:rPr>
+        <w:t>Nagy örömmel! Az évek során számos csodálatos szabadtéri helyszínt és professzionális, gyönyörűen berendezett napfény-stúdiót ismertem meg. Miután átbeszéltük, hogy pontosan milyen hangulatú képeket szeretnétek (például letisztult elegáns, romantikus természetközeli, vagy épp modern indusztriális), több konkrét opciót is fogok javasolni képekkel illusztrálva, amikből közösen választhatjuk ki a legideálisabbat.</w:t>
+      </w:r>
+    </w:p>
+    <w:p>
+      <w:pPr>
+        <w:pStyle w:val="Listaszerbekezds"/>
+        <w:numPr>
           <w:ilvl w:val="1"/>
           <w:numId w:val="1"/>
         </w:numPr>
@@ -488,12 +1090,36 @@
       </w:pPr>
       <w:r>
         <w:rPr>
-          <w:rFonts w:ascii="-webkit-standard" w:hAnsi="-webkit-standard"/>
+          <w:rFonts w:ascii="-webkit-standard" w:hAnsi="-webkit-standard" w:cs="-webkit-standard"/>
           <w:color w:val="000000"/>
           <w:sz w:val="27"/>
           <w:szCs w:val="27"/>
         </w:rPr>
         <w:t>A stúdió bérleti díját tartalmazza a fotózási ár?</w:t>
+      </w:r>
+    </w:p>
+    <w:p>
+      <w:pPr>
+        <w:pStyle w:val="Listaszerbekezds"/>
+        <w:numPr>
+          <w:ilvl w:val="2"/>
+          <w:numId w:val="1"/>
+        </w:numPr>
+        <w:rPr>
+          <w:rFonts w:ascii="Times New Roman" w:hAnsi="Times New Roman" w:cs="Times New Roman"/>
+          <w:color w:val="000000"/>
+          <w:sz w:val="20"/>
+          <w:szCs w:val="20"/>
+        </w:rPr>
+      </w:pPr>
+      <w:r>
+        <w:rPr>
+          <w:rFonts w:ascii="Times New Roman" w:hAnsi="Times New Roman" w:cs="Times New Roman"/>
+          <w:color w:val="000000"/>
+          <w:sz w:val="20"/>
+          <w:szCs w:val="20"/>
+        </w:rPr>
+        <w:t>Alapesetben a fotózási csomagjaim a stúdiók bérleti díját nem tartalmazzák, mivel a különböző stúdiók árai, méretei és feltételei nagyon eltérőek lehetnek (általában 8.000 - 15.000 Ft / óra között mozognak). Miután közösen kiválasztottuk a nektek leginkább tetsző termet, a stúdió bérleti díja külön kerül felszámításra. Magát a foglalás adminisztrációját és a stúdióval való egyeztetést természetesen teljes egészében én intézem, nektek ezzel nem lesz gondotok!</w:t>
       </w:r>
     </w:p>
     <w:sectPr>
@@ -1517,6 +2143,11 @@
       <w:spacing w:val="5"/>
     </w:rPr>
   </w:style>
+  <w:style w:type="character" w:customStyle="1" w:styleId="apple-converted-space">
+    <w:name w:val="apple-converted-space"/>
+    <w:basedOn w:val="Bekezdsalapbettpusa"/>
+    <w:rsid w:val="00344D89"/>
+  </w:style>
 </w:styles>
 </file>
 

</xml_diff>

<commit_message>
Kérdez felelek rész levan forditva angolra.
</commit_message>
<xml_diff>
--- a/FAQ.docx
+++ b/FAQ.docx
@@ -185,16 +185,7 @@
           <w:sz w:val="20"/>
           <w:szCs w:val="20"/>
         </w:rPr>
-        <w:t>T</w:t>
-      </w:r>
-      <w:r>
-        <w:rPr>
-          <w:rFonts w:ascii="Times New Roman" w:hAnsi="Times New Roman" w:cs="Times New Roman"/>
-          <w:color w:val="000000"/>
-          <w:sz w:val="20"/>
-          <w:szCs w:val="20"/>
-        </w:rPr>
-        <w:t>udom, hogy az életben bármikor közbejöhet valami váratlan (például betegség, vagy szabadtéri fotózásnál a rossz időjárás). Ilyen esetekben rugalmas vagyok: lehetőség van az időpont egyszeri, díjmentes módosítására, amennyiben azt a fotózás előtt legalább 48 órával jelzed nekem. Végleges lemondás, vagy az utolsó pillanatban történő módosítás esetén azonban a foglaló visszafizetésére sajnos nincs mód, hiszen azt az időpontot másnak már nem tudom kiadni</w:t>
+        <w:t>Tudom, hogy az életben bármikor közbejöhet valami váratlan (például betegség, vagy szabadtéri fotózásnál a rossz időjárás). Ilyen esetekben rugalmas vagyok: lehetőség van az időpont egyszeri, díjmentes módosítására, amennyiben azt a fotózás előtt legalább 48 órával jelzed nekem. Végleges lemondás, vagy az utolsó pillanatban történő módosítás esetén azonban a foglaló visszafizetésére sajnos nincs mód, hiszen azt az időpontot másnak már nem tudom kiadni</w:t>
       </w:r>
       <w:r>
         <w:rPr>
@@ -996,16 +987,7 @@
           <w:sz w:val="20"/>
           <w:szCs w:val="20"/>
         </w:rPr>
-        <w:t xml:space="preserve">Szarvas </w:t>
-      </w:r>
-      <w:r>
-        <w:rPr>
-          <w:rFonts w:ascii="Times New Roman" w:hAnsi="Times New Roman" w:cs="Times New Roman"/>
-          <w:color w:val="000000"/>
-          <w:sz w:val="20"/>
-          <w:szCs w:val="20"/>
-        </w:rPr>
-        <w:t xml:space="preserve">vonzáskörzetében a kiszállás általában díjmentes. Távolabbi helyszínek esetén egy korrekt, kilométer alapú útiköltséggel érdemes számolni. Szállásköltség csak </w:t>
+        <w:t xml:space="preserve">Szarvas vonzáskörzetében a kiszállás általában díjmentes. Távolabbi helyszínek esetén egy korrekt, kilométer alapú útiköltséggel érdemes számolni. Szállásköltség csak </w:t>
       </w:r>
       <w:proofErr w:type="gramStart"/>
       <w:r>
@@ -1120,6 +1102,1299 @@
           <w:szCs w:val="20"/>
         </w:rPr>
         <w:t>Alapesetben a fotózási csomagjaim a stúdiók bérleti díját nem tartalmazzák, mivel a különböző stúdiók árai, méretei és feltételei nagyon eltérőek lehetnek (általában 8.000 - 15.000 Ft / óra között mozognak). Miután közösen kiválasztottuk a nektek leginkább tetsző termet, a stúdió bérleti díja külön kerül felszámításra. Magát a foglalás adminisztrációját és a stúdióval való egyeztetést természetesen teljes egészében én intézem, nektek ezzel nem lesz gondotok!</w:t>
+      </w:r>
+    </w:p>
+    <w:p>
+      <w:pPr>
+        <w:rPr>
+          <w:rFonts w:ascii="Times New Roman" w:hAnsi="Times New Roman" w:cs="Times New Roman"/>
+          <w:color w:val="000000"/>
+          <w:sz w:val="20"/>
+          <w:szCs w:val="20"/>
+        </w:rPr>
+      </w:pPr>
+      <w:r>
+        <w:rPr>
+          <w:rFonts w:ascii="Times New Roman" w:hAnsi="Times New Roman" w:cs="Times New Roman"/>
+          <w:color w:val="000000"/>
+          <w:sz w:val="20"/>
+          <w:szCs w:val="20"/>
+        </w:rPr>
+        <w:br w:type="page"/>
+      </w:r>
+    </w:p>
+    <w:p>
+      <w:pPr>
+        <w:jc w:val="center"/>
+        <w:rPr>
+          <w:rFonts w:ascii="Times New Roman" w:hAnsi="Times New Roman" w:cs="Times New Roman"/>
+          <w:sz w:val="50"/>
+          <w:szCs w:val="50"/>
+          <w:lang w:val="en-GB"/>
+        </w:rPr>
+      </w:pPr>
+      <w:r>
+        <w:rPr>
+          <w:rFonts w:ascii="Times New Roman" w:hAnsi="Times New Roman" w:cs="Times New Roman"/>
+          <w:sz w:val="50"/>
+          <w:szCs w:val="50"/>
+          <w:lang w:val="en-GB"/>
+        </w:rPr>
+        <w:lastRenderedPageBreak/>
+        <w:t>FAQ</w:t>
+      </w:r>
+    </w:p>
+    <w:p>
+      <w:pPr>
+        <w:pStyle w:val="Listaszerbekezds"/>
+        <w:numPr>
+          <w:ilvl w:val="0"/>
+          <w:numId w:val="2"/>
+        </w:numPr>
+        <w:rPr>
+          <w:rFonts w:ascii="Times New Roman" w:hAnsi="Times New Roman" w:cs="Times New Roman"/>
+          <w:sz w:val="30"/>
+          <w:szCs w:val="30"/>
+          <w:lang w:val="en-GB"/>
+        </w:rPr>
+      </w:pPr>
+      <w:r>
+        <w:rPr>
+          <w:rFonts w:ascii="Times New Roman" w:hAnsi="Times New Roman" w:cs="Times New Roman"/>
+          <w:color w:val="000000"/>
+          <w:sz w:val="30"/>
+          <w:szCs w:val="30"/>
+          <w:lang w:val="en-GB"/>
+        </w:rPr>
+        <w:t>Booking &amp; Payment</w:t>
+      </w:r>
+      <w:r>
+        <w:rPr>
+          <w:rFonts w:ascii="Times New Roman" w:hAnsi="Times New Roman" w:cs="Times New Roman"/>
+          <w:sz w:val="30"/>
+          <w:szCs w:val="30"/>
+          <w:lang w:val="en-GB"/>
+        </w:rPr>
+        <w:t> </w:t>
+      </w:r>
+    </w:p>
+    <w:p>
+      <w:pPr>
+        <w:pStyle w:val="Listaszerbekezds"/>
+        <w:numPr>
+          <w:ilvl w:val="1"/>
+          <w:numId w:val="2"/>
+        </w:numPr>
+        <w:rPr>
+          <w:rFonts w:ascii="Times New Roman" w:hAnsi="Times New Roman" w:cs="Times New Roman"/>
+          <w:sz w:val="30"/>
+          <w:szCs w:val="30"/>
+          <w:lang w:val="en-GB"/>
+        </w:rPr>
+      </w:pPr>
+      <w:r>
+        <w:rPr>
+          <w:rFonts w:ascii="-webkit-standard" w:hAnsi="-webkit-standard" w:cs="-webkit-standard"/>
+          <w:color w:val="000000"/>
+          <w:sz w:val="27"/>
+          <w:szCs w:val="27"/>
+          <w:lang w:val="en-GB"/>
+        </w:rPr>
+        <w:t>How far in advance should I book a session?</w:t>
+      </w:r>
+      <w:r>
+        <w:rPr>
+          <w:rFonts w:ascii="-webkit-standard" w:hAnsi="-webkit-standard" w:cs="-webkit-standard"/>
+          <w:sz w:val="27"/>
+          <w:szCs w:val="27"/>
+          <w:lang w:val="en-GB"/>
+        </w:rPr>
+        <w:t> </w:t>
+      </w:r>
+    </w:p>
+    <w:p>
+      <w:pPr>
+        <w:pStyle w:val="Listaszerbekezds"/>
+        <w:numPr>
+          <w:ilvl w:val="2"/>
+          <w:numId w:val="2"/>
+        </w:numPr>
+        <w:rPr>
+          <w:rFonts w:ascii="Times New Roman" w:hAnsi="Times New Roman" w:cs="Times New Roman"/>
+          <w:sz w:val="30"/>
+          <w:szCs w:val="30"/>
+          <w:lang w:val="en-GB"/>
+        </w:rPr>
+      </w:pPr>
+      <w:r>
+        <w:rPr>
+          <w:rFonts w:ascii="Times New Roman" w:hAnsi="Times New Roman" w:cs="Times New Roman"/>
+          <w:color w:val="000000"/>
+          <w:sz w:val="20"/>
+          <w:szCs w:val="20"/>
+          <w:lang w:val="en-GB"/>
+        </w:rPr>
+        <w:t xml:space="preserve">The booking timeframe depends on the type of photoshoot. For weddings and larger events, it's recommended to reach out 6–12 months before the big day, as spring and summer weekends fill up quickly. For smaller sessions (such as portrait, sports, or </w:t>
+      </w:r>
+      <w:proofErr w:type="gramStart"/>
+      <w:r>
+        <w:rPr>
+          <w:rFonts w:ascii="Times New Roman" w:hAnsi="Times New Roman" w:cs="Times New Roman"/>
+          <w:color w:val="000000"/>
+          <w:sz w:val="20"/>
+          <w:szCs w:val="20"/>
+          <w:lang w:val="en-GB"/>
+        </w:rPr>
+        <w:t>couples</w:t>
+      </w:r>
+      <w:proofErr w:type="gramEnd"/>
+      <w:r>
+        <w:rPr>
+          <w:rFonts w:ascii="Times New Roman" w:hAnsi="Times New Roman" w:cs="Times New Roman"/>
+          <w:color w:val="000000"/>
+          <w:sz w:val="20"/>
+          <w:szCs w:val="20"/>
+          <w:lang w:val="en-GB"/>
+        </w:rPr>
+        <w:t xml:space="preserve"> photography), reaching out 2–4 weeks in advance is usually sufficient. In any case, I recommend contacting me as soon as you have an idea in mind so we can secure the perfect date!</w:t>
+      </w:r>
+    </w:p>
+    <w:p>
+      <w:pPr>
+        <w:pStyle w:val="Listaszerbekezds"/>
+        <w:numPr>
+          <w:ilvl w:val="1"/>
+          <w:numId w:val="2"/>
+        </w:numPr>
+        <w:rPr>
+          <w:rFonts w:ascii="-webkit-standard" w:hAnsi="-webkit-standard" w:cs="-webkit-standard"/>
+          <w:color w:val="000000"/>
+          <w:sz w:val="27"/>
+          <w:szCs w:val="27"/>
+          <w:lang w:val="en-GB"/>
+        </w:rPr>
+      </w:pPr>
+      <w:r>
+        <w:rPr>
+          <w:rFonts w:ascii="-webkit-standard" w:hAnsi="-webkit-standard" w:cs="-webkit-standard"/>
+          <w:color w:val="000000"/>
+          <w:sz w:val="27"/>
+          <w:szCs w:val="27"/>
+          <w:lang w:val="en-GB"/>
+        </w:rPr>
+        <w:t>How is the booking finalized? Is a deposit required?</w:t>
+      </w:r>
+      <w:r>
+        <w:rPr>
+          <w:rFonts w:ascii="-webkit-standard" w:hAnsi="-webkit-standard" w:cs="-webkit-standard"/>
+          <w:sz w:val="27"/>
+          <w:szCs w:val="27"/>
+          <w:lang w:val="en-GB"/>
+        </w:rPr>
+        <w:t> </w:t>
+      </w:r>
+    </w:p>
+    <w:p>
+      <w:pPr>
+        <w:pStyle w:val="Listaszerbekezds"/>
+        <w:numPr>
+          <w:ilvl w:val="2"/>
+          <w:numId w:val="2"/>
+        </w:numPr>
+        <w:rPr>
+          <w:rFonts w:ascii="Times New Roman" w:hAnsi="Times New Roman" w:cs="Times New Roman"/>
+          <w:color w:val="000000"/>
+          <w:sz w:val="20"/>
+          <w:szCs w:val="20"/>
+          <w:lang w:val="en-GB"/>
+        </w:rPr>
+      </w:pPr>
+      <w:r>
+        <w:rPr>
+          <w:rFonts w:ascii="Times New Roman" w:hAnsi="Times New Roman" w:cs="Times New Roman"/>
+          <w:color w:val="000000"/>
+          <w:sz w:val="20"/>
+          <w:szCs w:val="20"/>
+          <w:lang w:val="en-GB"/>
+        </w:rPr>
+        <w:t>Yes, your date becomes officially finalized and guaranteed in my calendar upon the payment of a deposit (and the acceptance of a contract for larger events). The deposit is typically 20–30% of the total amount, which will naturally be deducted from the final cost of the photoshoot. Until this is completed, I will hold the date tentatively, but it remains open to other inquiries.</w:t>
+      </w:r>
+    </w:p>
+    <w:p>
+      <w:pPr>
+        <w:pStyle w:val="Listaszerbekezds"/>
+        <w:numPr>
+          <w:ilvl w:val="1"/>
+          <w:numId w:val="2"/>
+        </w:numPr>
+        <w:rPr>
+          <w:rFonts w:ascii="-webkit-standard" w:hAnsi="-webkit-standard" w:cs="-webkit-standard"/>
+          <w:color w:val="000000"/>
+          <w:sz w:val="27"/>
+          <w:szCs w:val="27"/>
+          <w:lang w:val="en-GB"/>
+        </w:rPr>
+      </w:pPr>
+      <w:r>
+        <w:rPr>
+          <w:rFonts w:ascii="-webkit-standard" w:hAnsi="-webkit-standard" w:cs="-webkit-standard"/>
+          <w:color w:val="000000"/>
+          <w:sz w:val="27"/>
+          <w:szCs w:val="27"/>
+          <w:lang w:val="en-GB"/>
+        </w:rPr>
+        <w:t>What happens if I need to cancel or reschedule the photoshoot?</w:t>
+      </w:r>
+    </w:p>
+    <w:p>
+      <w:pPr>
+        <w:pStyle w:val="Listaszerbekezds"/>
+        <w:numPr>
+          <w:ilvl w:val="2"/>
+          <w:numId w:val="2"/>
+        </w:numPr>
+        <w:rPr>
+          <w:rFonts w:ascii="Times New Roman" w:hAnsi="Times New Roman" w:cs="Times New Roman"/>
+          <w:color w:val="000000"/>
+          <w:sz w:val="20"/>
+          <w:szCs w:val="20"/>
+          <w:lang w:val="en-GB"/>
+        </w:rPr>
+      </w:pPr>
+      <w:r>
+        <w:rPr>
+          <w:rFonts w:ascii="Times New Roman" w:hAnsi="Times New Roman" w:cs="Times New Roman"/>
+          <w:color w:val="000000"/>
+          <w:sz w:val="20"/>
+          <w:szCs w:val="20"/>
+          <w:lang w:val="en-GB"/>
+        </w:rPr>
+        <w:t>I understand that unexpected things can happen (such as illness or bad weather for outdoor shoots). I am flexible in these situations: you have the option to reschedule your session once, free of charge, provided you notify me at least 48 hours in advance. However, in the case of a permanent cancellation or last-minute rescheduling, the deposit is unfortunately non-refundable, as I can no longer offer that time slot to someone else.</w:t>
+      </w:r>
+    </w:p>
+    <w:p>
+      <w:pPr>
+        <w:pStyle w:val="Listaszerbekezds"/>
+        <w:numPr>
+          <w:ilvl w:val="1"/>
+          <w:numId w:val="2"/>
+        </w:numPr>
+        <w:rPr>
+          <w:rFonts w:ascii="-webkit-standard" w:hAnsi="-webkit-standard" w:cs="-webkit-standard"/>
+          <w:color w:val="000000"/>
+          <w:sz w:val="27"/>
+          <w:szCs w:val="27"/>
+          <w:lang w:val="en-GB"/>
+        </w:rPr>
+      </w:pPr>
+      <w:r>
+        <w:rPr>
+          <w:rFonts w:ascii="-webkit-standard" w:hAnsi="-webkit-standard" w:cs="-webkit-standard"/>
+          <w:color w:val="000000"/>
+          <w:sz w:val="27"/>
+          <w:szCs w:val="27"/>
+          <w:lang w:val="en-GB"/>
+        </w:rPr>
+        <w:t>What payment methods are available?</w:t>
+      </w:r>
+      <w:r>
+        <w:rPr>
+          <w:rFonts w:ascii="-webkit-standard" w:hAnsi="-webkit-standard" w:cs="-webkit-standard"/>
+          <w:sz w:val="27"/>
+          <w:szCs w:val="27"/>
+          <w:lang w:val="en-GB"/>
+        </w:rPr>
+        <w:t> </w:t>
+      </w:r>
+    </w:p>
+    <w:p>
+      <w:pPr>
+        <w:pStyle w:val="Listaszerbekezds"/>
+        <w:numPr>
+          <w:ilvl w:val="2"/>
+          <w:numId w:val="2"/>
+        </w:numPr>
+        <w:rPr>
+          <w:rFonts w:ascii="Times New Roman" w:hAnsi="Times New Roman" w:cs="Times New Roman"/>
+          <w:color w:val="000000"/>
+          <w:sz w:val="20"/>
+          <w:szCs w:val="20"/>
+          <w:lang w:val="en-GB"/>
+        </w:rPr>
+      </w:pPr>
+      <w:r>
+        <w:rPr>
+          <w:rFonts w:ascii="Times New Roman" w:hAnsi="Times New Roman" w:cs="Times New Roman"/>
+          <w:color w:val="000000"/>
+          <w:sz w:val="20"/>
+          <w:szCs w:val="20"/>
+          <w:lang w:val="en-GB"/>
+        </w:rPr>
+        <w:t>The remaining balance can be settled in cash on the day of the photoshoot or via bank transfer (no later than the delivery of the final edited photos). I issue an invoice for all my services, making corporate bank transfers seamless for businesses and companies.</w:t>
+      </w:r>
+    </w:p>
+    <w:p>
+      <w:pPr>
+        <w:pStyle w:val="Listaszerbekezds"/>
+        <w:numPr>
+          <w:ilvl w:val="0"/>
+          <w:numId w:val="2"/>
+        </w:numPr>
+        <w:rPr>
+          <w:rFonts w:ascii="Times New Roman" w:hAnsi="Times New Roman" w:cs="Times New Roman"/>
+          <w:sz w:val="30"/>
+          <w:szCs w:val="30"/>
+          <w:lang w:val="en-GB"/>
+        </w:rPr>
+      </w:pPr>
+      <w:r>
+        <w:rPr>
+          <w:rFonts w:ascii="Times New Roman" w:hAnsi="Times New Roman" w:cs="Times New Roman"/>
+          <w:color w:val="000000"/>
+          <w:sz w:val="30"/>
+          <w:szCs w:val="30"/>
+          <w:lang w:val="en-GB"/>
+        </w:rPr>
+        <w:t>The Photoshoot Process &amp; Preparation</w:t>
+      </w:r>
+      <w:r>
+        <w:rPr>
+          <w:rFonts w:ascii="Times New Roman" w:hAnsi="Times New Roman" w:cs="Times New Roman"/>
+          <w:sz w:val="30"/>
+          <w:szCs w:val="30"/>
+          <w:lang w:val="en-GB"/>
+        </w:rPr>
+        <w:t> </w:t>
+      </w:r>
+    </w:p>
+    <w:p>
+      <w:pPr>
+        <w:pStyle w:val="Listaszerbekezds"/>
+        <w:numPr>
+          <w:ilvl w:val="1"/>
+          <w:numId w:val="2"/>
+        </w:numPr>
+        <w:rPr>
+          <w:rFonts w:ascii="-webkit-standard" w:hAnsi="-webkit-standard" w:cs="-webkit-standard"/>
+          <w:color w:val="000000"/>
+          <w:sz w:val="27"/>
+          <w:szCs w:val="27"/>
+          <w:lang w:val="en-GB"/>
+        </w:rPr>
+      </w:pPr>
+      <w:r>
+        <w:rPr>
+          <w:rFonts w:ascii="-webkit-standard" w:hAnsi="-webkit-standard" w:cs="-webkit-standard"/>
+          <w:color w:val="000000"/>
+          <w:sz w:val="27"/>
+          <w:szCs w:val="27"/>
+          <w:lang w:val="en-GB"/>
+        </w:rPr>
+        <w:t>What should we wear for the photoshoot?</w:t>
+      </w:r>
+      <w:r>
+        <w:rPr>
+          <w:rFonts w:ascii="-webkit-standard" w:hAnsi="-webkit-standard" w:cs="-webkit-standard"/>
+          <w:sz w:val="27"/>
+          <w:szCs w:val="27"/>
+          <w:lang w:val="en-GB"/>
+        </w:rPr>
+        <w:t> </w:t>
+      </w:r>
+    </w:p>
+    <w:p>
+      <w:pPr>
+        <w:pStyle w:val="Listaszerbekezds"/>
+        <w:numPr>
+          <w:ilvl w:val="2"/>
+          <w:numId w:val="2"/>
+        </w:numPr>
+        <w:rPr>
+          <w:rFonts w:ascii="Times New Roman" w:hAnsi="Times New Roman" w:cs="Times New Roman"/>
+          <w:color w:val="000000"/>
+          <w:sz w:val="20"/>
+          <w:szCs w:val="20"/>
+          <w:lang w:val="en-GB"/>
+        </w:rPr>
+      </w:pPr>
+      <w:r>
+        <w:rPr>
+          <w:rFonts w:ascii="Times New Roman" w:hAnsi="Times New Roman" w:cs="Times New Roman"/>
+          <w:color w:val="000000"/>
+          <w:sz w:val="20"/>
+          <w:szCs w:val="20"/>
+          <w:lang w:val="en-GB"/>
+        </w:rPr>
+        <w:t xml:space="preserve">The most important thing is that you feel comfortable in what you're wearing! It’s best to avoid large, flashy logos, neon </w:t>
+      </w:r>
+      <w:proofErr w:type="spellStart"/>
+      <w:r>
+        <w:rPr>
+          <w:rFonts w:ascii="Times New Roman" w:hAnsi="Times New Roman" w:cs="Times New Roman"/>
+          <w:color w:val="000000"/>
+          <w:sz w:val="20"/>
+          <w:szCs w:val="20"/>
+          <w:lang w:val="en-GB"/>
+        </w:rPr>
+        <w:t>colors</w:t>
+      </w:r>
+      <w:proofErr w:type="spellEnd"/>
+      <w:r>
+        <w:rPr>
+          <w:rFonts w:ascii="Times New Roman" w:hAnsi="Times New Roman" w:cs="Times New Roman"/>
+          <w:color w:val="000000"/>
+          <w:sz w:val="20"/>
+          <w:szCs w:val="20"/>
+          <w:lang w:val="en-GB"/>
+        </w:rPr>
+        <w:t xml:space="preserve">, and overly dense, small patterns, as they distract from your faces. For couples or family shoots, you don't need to match perfectly; the result is much more aesthetic if you choose 2–3 harmonious </w:t>
+      </w:r>
+      <w:proofErr w:type="spellStart"/>
+      <w:r>
+        <w:rPr>
+          <w:rFonts w:ascii="Times New Roman" w:hAnsi="Times New Roman" w:cs="Times New Roman"/>
+          <w:color w:val="000000"/>
+          <w:sz w:val="20"/>
+          <w:szCs w:val="20"/>
+          <w:lang w:val="en-GB"/>
+        </w:rPr>
+        <w:t>colors</w:t>
+      </w:r>
+      <w:proofErr w:type="spellEnd"/>
+      <w:r>
+        <w:rPr>
+          <w:rFonts w:ascii="Times New Roman" w:hAnsi="Times New Roman" w:cs="Times New Roman"/>
+          <w:color w:val="000000"/>
+          <w:sz w:val="20"/>
+          <w:szCs w:val="20"/>
+          <w:lang w:val="en-GB"/>
+        </w:rPr>
+        <w:t xml:space="preserve"> (such as earth tones or pastels). If you're unsure, I’m more than happy to help coordinate your outfits before the shoot!</w:t>
+      </w:r>
+    </w:p>
+    <w:p>
+      <w:pPr>
+        <w:pStyle w:val="Listaszerbekezds"/>
+        <w:numPr>
+          <w:ilvl w:val="1"/>
+          <w:numId w:val="2"/>
+        </w:numPr>
+        <w:rPr>
+          <w:rFonts w:ascii="-webkit-standard" w:hAnsi="-webkit-standard" w:cs="-webkit-standard"/>
+          <w:color w:val="000000"/>
+          <w:sz w:val="27"/>
+          <w:szCs w:val="27"/>
+          <w:lang w:val="en-GB"/>
+        </w:rPr>
+      </w:pPr>
+      <w:r>
+        <w:rPr>
+          <w:rFonts w:ascii="-webkit-standard" w:hAnsi="-webkit-standard" w:cs="-webkit-standard"/>
+          <w:color w:val="000000"/>
+          <w:sz w:val="27"/>
+          <w:szCs w:val="27"/>
+          <w:lang w:val="en-GB"/>
+        </w:rPr>
+        <w:t>We don't know how to pose, and I'm camera-shy. How does the session work?</w:t>
+      </w:r>
+      <w:r>
+        <w:rPr>
+          <w:rFonts w:ascii="-webkit-standard" w:hAnsi="-webkit-standard" w:cs="-webkit-standard"/>
+          <w:sz w:val="27"/>
+          <w:szCs w:val="27"/>
+          <w:lang w:val="en-GB"/>
+        </w:rPr>
+        <w:t> </w:t>
+      </w:r>
+    </w:p>
+    <w:p>
+      <w:pPr>
+        <w:pStyle w:val="Listaszerbekezds"/>
+        <w:numPr>
+          <w:ilvl w:val="2"/>
+          <w:numId w:val="2"/>
+        </w:numPr>
+        <w:rPr>
+          <w:rFonts w:ascii="Times New Roman" w:hAnsi="Times New Roman" w:cs="Times New Roman"/>
+          <w:color w:val="000000"/>
+          <w:sz w:val="20"/>
+          <w:szCs w:val="20"/>
+          <w:lang w:val="en-GB"/>
+        </w:rPr>
+      </w:pPr>
+      <w:r>
+        <w:rPr>
+          <w:rFonts w:ascii="Times New Roman" w:hAnsi="Times New Roman" w:cs="Times New Roman"/>
+          <w:color w:val="000000"/>
+          <w:sz w:val="20"/>
+          <w:szCs w:val="20"/>
+          <w:lang w:val="en-GB"/>
+        </w:rPr>
+        <w:t>About 90% of my clients feel this way in the first few minutes, so there is absolutely no need to worry! My job is to ease any tension and guide you through the entire process. We won't force stiff, awkward poses; instead, I'll give you small prompts and playful tasks (like walking towards each other or saying something funny). This allows me to capture genuine, candid moments and natural smiles. It will feel like a relaxed walk that you’ll actually enjoy by the end!</w:t>
+      </w:r>
+    </w:p>
+    <w:p>
+      <w:pPr>
+        <w:pStyle w:val="Listaszerbekezds"/>
+        <w:numPr>
+          <w:ilvl w:val="1"/>
+          <w:numId w:val="2"/>
+        </w:numPr>
+        <w:rPr>
+          <w:rFonts w:ascii="-webkit-standard" w:hAnsi="-webkit-standard" w:cs="-webkit-standard"/>
+          <w:color w:val="000000"/>
+          <w:sz w:val="27"/>
+          <w:szCs w:val="27"/>
+          <w:lang w:val="en-GB"/>
+        </w:rPr>
+      </w:pPr>
+      <w:r>
+        <w:rPr>
+          <w:rFonts w:ascii="-webkit-standard" w:hAnsi="-webkit-standard" w:cs="-webkit-standard"/>
+          <w:color w:val="000000"/>
+          <w:sz w:val="27"/>
+          <w:szCs w:val="27"/>
+          <w:lang w:val="en-GB"/>
+        </w:rPr>
+        <w:lastRenderedPageBreak/>
+        <w:t>What happens if the weather is bad on the day of an outdoor shoot?</w:t>
+      </w:r>
+      <w:r>
+        <w:rPr>
+          <w:rFonts w:ascii="-webkit-standard" w:hAnsi="-webkit-standard" w:cs="-webkit-standard"/>
+          <w:sz w:val="27"/>
+          <w:szCs w:val="27"/>
+          <w:lang w:val="en-GB"/>
+        </w:rPr>
+        <w:t> </w:t>
+      </w:r>
+    </w:p>
+    <w:p>
+      <w:pPr>
+        <w:pStyle w:val="Listaszerbekezds"/>
+        <w:numPr>
+          <w:ilvl w:val="2"/>
+          <w:numId w:val="2"/>
+        </w:numPr>
+        <w:rPr>
+          <w:rFonts w:ascii="Times New Roman" w:hAnsi="Times New Roman" w:cs="Times New Roman"/>
+          <w:color w:val="000000"/>
+          <w:sz w:val="20"/>
+          <w:szCs w:val="20"/>
+          <w:lang w:val="en-GB"/>
+        </w:rPr>
+      </w:pPr>
+      <w:r>
+        <w:rPr>
+          <w:rFonts w:ascii="Times New Roman" w:hAnsi="Times New Roman" w:cs="Times New Roman"/>
+          <w:color w:val="000000"/>
+          <w:sz w:val="20"/>
+          <w:szCs w:val="20"/>
+          <w:lang w:val="en-GB"/>
+        </w:rPr>
+        <w:t>The weather is the only thing we can't control, but we always have a "Plan B." We will continuously monitor the forecast in the days leading up to the shoot. If heavy rain or a storm is expected, we will flexibly and free of charge find a new date that works for both of us. If the date cannot be moved, as an alternative, we can relocate the session to a beautiful, rented daylight studio or another exciting indoor location.</w:t>
+      </w:r>
+    </w:p>
+    <w:p>
+      <w:pPr>
+        <w:pStyle w:val="Listaszerbekezds"/>
+        <w:numPr>
+          <w:ilvl w:val="1"/>
+          <w:numId w:val="2"/>
+        </w:numPr>
+        <w:rPr>
+          <w:rFonts w:ascii="-webkit-standard" w:hAnsi="-webkit-standard" w:cs="-webkit-standard"/>
+          <w:color w:val="000000"/>
+          <w:sz w:val="27"/>
+          <w:szCs w:val="27"/>
+          <w:lang w:val="en-GB"/>
+        </w:rPr>
+      </w:pPr>
+      <w:r>
+        <w:rPr>
+          <w:rFonts w:ascii="-webkit-standard" w:hAnsi="-webkit-standard" w:cs="-webkit-standard"/>
+          <w:color w:val="000000"/>
+          <w:sz w:val="27"/>
+          <w:szCs w:val="27"/>
+          <w:lang w:val="en-GB"/>
+        </w:rPr>
+        <w:t>Can we bring our own props or pets?</w:t>
+      </w:r>
+      <w:r>
+        <w:rPr>
+          <w:rFonts w:ascii="-webkit-standard" w:hAnsi="-webkit-standard" w:cs="-webkit-standard"/>
+          <w:sz w:val="27"/>
+          <w:szCs w:val="27"/>
+          <w:lang w:val="en-GB"/>
+        </w:rPr>
+        <w:t> </w:t>
+      </w:r>
+    </w:p>
+    <w:p>
+      <w:pPr>
+        <w:pStyle w:val="Listaszerbekezds"/>
+        <w:numPr>
+          <w:ilvl w:val="2"/>
+          <w:numId w:val="2"/>
+        </w:numPr>
+        <w:rPr>
+          <w:rFonts w:ascii="Times New Roman" w:hAnsi="Times New Roman" w:cs="Times New Roman"/>
+          <w:color w:val="000000"/>
+          <w:sz w:val="20"/>
+          <w:szCs w:val="20"/>
+          <w:lang w:val="en-GB"/>
+        </w:rPr>
+      </w:pPr>
+      <w:r>
+        <w:rPr>
+          <w:rFonts w:ascii="Times New Roman" w:hAnsi="Times New Roman" w:cs="Times New Roman"/>
+          <w:color w:val="000000"/>
+          <w:sz w:val="20"/>
+          <w:szCs w:val="20"/>
+          <w:lang w:val="en-GB"/>
+        </w:rPr>
+        <w:t xml:space="preserve">Absolutely, in fact, I highly recommend it! Any personal prop (a </w:t>
+      </w:r>
+      <w:proofErr w:type="spellStart"/>
+      <w:r>
+        <w:rPr>
+          <w:rFonts w:ascii="Times New Roman" w:hAnsi="Times New Roman" w:cs="Times New Roman"/>
+          <w:color w:val="000000"/>
+          <w:sz w:val="20"/>
+          <w:szCs w:val="20"/>
+          <w:lang w:val="en-GB"/>
+        </w:rPr>
+        <w:t>favorite</w:t>
+      </w:r>
+      <w:proofErr w:type="spellEnd"/>
+      <w:r>
+        <w:rPr>
+          <w:rFonts w:ascii="Times New Roman" w:hAnsi="Times New Roman" w:cs="Times New Roman"/>
+          <w:color w:val="000000"/>
+          <w:sz w:val="20"/>
+          <w:szCs w:val="20"/>
+          <w:lang w:val="en-GB"/>
+        </w:rPr>
+        <w:t xml:space="preserve"> hat, an instrument, or a meaningful item) makes the photos much more unique and personal. Pets also add a huge plus to the experience, so feel free to bring them along to outdoor (or pet-friendly studio) shoots. I only ask that you let me know in advance, and it's a good idea to bring an extra person to keep an eye on your dog/cat during the few minutes when we take photos of just the two of you.</w:t>
+      </w:r>
+    </w:p>
+    <w:p>
+      <w:pPr>
+        <w:pStyle w:val="Listaszerbekezds"/>
+        <w:numPr>
+          <w:ilvl w:val="0"/>
+          <w:numId w:val="2"/>
+        </w:numPr>
+        <w:rPr>
+          <w:rFonts w:ascii="Times New Roman" w:hAnsi="Times New Roman" w:cs="Times New Roman"/>
+          <w:color w:val="000000"/>
+          <w:sz w:val="30"/>
+          <w:szCs w:val="30"/>
+          <w:lang w:val="en-GB"/>
+        </w:rPr>
+      </w:pPr>
+      <w:r>
+        <w:rPr>
+          <w:rFonts w:ascii="Times New Roman" w:hAnsi="Times New Roman" w:cs="Times New Roman"/>
+          <w:color w:val="000000"/>
+          <w:sz w:val="30"/>
+          <w:szCs w:val="30"/>
+          <w:lang w:val="en-GB"/>
+        </w:rPr>
+        <w:t>Photo Delivery, Retouching &amp; Quantity</w:t>
+      </w:r>
+      <w:r>
+        <w:rPr>
+          <w:rFonts w:ascii="Times New Roman" w:hAnsi="Times New Roman" w:cs="Times New Roman"/>
+          <w:sz w:val="30"/>
+          <w:szCs w:val="30"/>
+          <w:lang w:val="en-GB"/>
+        </w:rPr>
+        <w:t> </w:t>
+      </w:r>
+    </w:p>
+    <w:p>
+      <w:pPr>
+        <w:pStyle w:val="Listaszerbekezds"/>
+        <w:numPr>
+          <w:ilvl w:val="1"/>
+          <w:numId w:val="2"/>
+        </w:numPr>
+        <w:rPr>
+          <w:rFonts w:ascii="-webkit-standard" w:hAnsi="-webkit-standard" w:cs="-webkit-standard"/>
+          <w:sz w:val="27"/>
+          <w:szCs w:val="27"/>
+          <w:lang w:val="en-GB"/>
+        </w:rPr>
+      </w:pPr>
+      <w:r>
+        <w:rPr>
+          <w:rFonts w:ascii="-webkit-standard" w:hAnsi="-webkit-standard" w:cs="-webkit-standard"/>
+          <w:color w:val="000000"/>
+          <w:sz w:val="27"/>
+          <w:szCs w:val="27"/>
+          <w:lang w:val="en-GB"/>
+        </w:rPr>
+        <w:t>How many photos will we receive after the shoot?</w:t>
+      </w:r>
+      <w:r>
+        <w:rPr>
+          <w:rFonts w:ascii="-webkit-standard" w:hAnsi="-webkit-standard" w:cs="-webkit-standard"/>
+          <w:sz w:val="27"/>
+          <w:szCs w:val="27"/>
+          <w:lang w:val="en-GB"/>
+        </w:rPr>
+        <w:t> </w:t>
+      </w:r>
+    </w:p>
+    <w:p>
+      <w:pPr>
+        <w:pStyle w:val="Listaszerbekezds"/>
+        <w:numPr>
+          <w:ilvl w:val="2"/>
+          <w:numId w:val="2"/>
+        </w:numPr>
+        <w:rPr>
+          <w:rFonts w:ascii="Times New Roman" w:hAnsi="Times New Roman" w:cs="Times New Roman"/>
+          <w:color w:val="000000"/>
+          <w:sz w:val="20"/>
+          <w:szCs w:val="20"/>
+          <w:lang w:val="en-GB"/>
+        </w:rPr>
+      </w:pPr>
+      <w:r>
+        <w:rPr>
+          <w:rFonts w:ascii="Times New Roman" w:hAnsi="Times New Roman" w:cs="Times New Roman"/>
+          <w:color w:val="000000"/>
+          <w:sz w:val="20"/>
+          <w:szCs w:val="20"/>
+          <w:lang w:val="en-GB"/>
+        </w:rPr>
+        <w:t xml:space="preserve">The number of edited, delivered photos depends on your chosen package and the type of photoshoot. For a shorter portrait or </w:t>
+      </w:r>
+      <w:proofErr w:type="gramStart"/>
+      <w:r>
+        <w:rPr>
+          <w:rFonts w:ascii="Times New Roman" w:hAnsi="Times New Roman" w:cs="Times New Roman"/>
+          <w:color w:val="000000"/>
+          <w:sz w:val="20"/>
+          <w:szCs w:val="20"/>
+          <w:lang w:val="en-GB"/>
+        </w:rPr>
+        <w:t>couples</w:t>
+      </w:r>
+      <w:proofErr w:type="gramEnd"/>
+      <w:r>
+        <w:rPr>
+          <w:rFonts w:ascii="Times New Roman" w:hAnsi="Times New Roman" w:cs="Times New Roman"/>
+          <w:color w:val="000000"/>
+          <w:sz w:val="20"/>
+          <w:szCs w:val="20"/>
+          <w:lang w:val="en-GB"/>
+        </w:rPr>
+        <w:t xml:space="preserve"> session, I typically deliver 15–30 carefully retouched photos, while for a full-day wedding or large event, this number can range from 300 to 600. The exact guaranteed number of photos will always be detailed in your custom quote, but if a shoot yields more brilliant, unrepeatable moments, I never hold them back!</w:t>
+      </w:r>
+    </w:p>
+    <w:p>
+      <w:pPr>
+        <w:pStyle w:val="Listaszerbekezds"/>
+        <w:numPr>
+          <w:ilvl w:val="1"/>
+          <w:numId w:val="2"/>
+        </w:numPr>
+        <w:rPr>
+          <w:rFonts w:ascii="-webkit-standard" w:hAnsi="-webkit-standard" w:cs="-webkit-standard"/>
+          <w:sz w:val="27"/>
+          <w:szCs w:val="27"/>
+          <w:lang w:val="en-GB"/>
+        </w:rPr>
+      </w:pPr>
+      <w:r>
+        <w:rPr>
+          <w:rFonts w:ascii="-webkit-standard" w:hAnsi="-webkit-standard" w:cs="-webkit-standard"/>
+          <w:color w:val="000000"/>
+          <w:sz w:val="27"/>
+          <w:szCs w:val="27"/>
+          <w:lang w:val="en-GB"/>
+        </w:rPr>
+        <w:t>What is the turnaround time for the final photos?</w:t>
+      </w:r>
+      <w:r>
+        <w:rPr>
+          <w:rFonts w:ascii="-webkit-standard" w:hAnsi="-webkit-standard" w:cs="-webkit-standard"/>
+          <w:sz w:val="27"/>
+          <w:szCs w:val="27"/>
+          <w:lang w:val="en-GB"/>
+        </w:rPr>
+        <w:t> </w:t>
+      </w:r>
+    </w:p>
+    <w:p>
+      <w:pPr>
+        <w:pStyle w:val="Listaszerbekezds"/>
+        <w:numPr>
+          <w:ilvl w:val="2"/>
+          <w:numId w:val="2"/>
+        </w:numPr>
+        <w:rPr>
+          <w:rFonts w:ascii="Times New Roman" w:hAnsi="Times New Roman" w:cs="Times New Roman"/>
+          <w:color w:val="000000"/>
+          <w:sz w:val="20"/>
+          <w:szCs w:val="20"/>
+          <w:lang w:val="en-GB"/>
+        </w:rPr>
+      </w:pPr>
+      <w:r>
+        <w:rPr>
+          <w:rFonts w:ascii="Times New Roman" w:hAnsi="Times New Roman" w:cs="Times New Roman"/>
+          <w:color w:val="000000"/>
+          <w:sz w:val="20"/>
+          <w:szCs w:val="20"/>
+          <w:lang w:val="en-GB"/>
+        </w:rPr>
+        <w:t>Quality post-processing takes time, as I individually edit and fine-tune every single photo delivered to ensure a perfect final result. For smaller sessions (portrait, sports, couples), I generally deliver the final gallery within 1–2 weeks. For larger events and weddings, the turnaround time is usually 4–6 weeks, depending on how busy the season is. Of course, after weddings and major events, I try to send a small sneak peek of the best moments within a few days!</w:t>
+      </w:r>
+    </w:p>
+    <w:p>
+      <w:pPr>
+        <w:pStyle w:val="Listaszerbekezds"/>
+        <w:numPr>
+          <w:ilvl w:val="1"/>
+          <w:numId w:val="2"/>
+        </w:numPr>
+        <w:rPr>
+          <w:rFonts w:ascii="-webkit-standard" w:hAnsi="-webkit-standard" w:cs="-webkit-standard"/>
+          <w:sz w:val="27"/>
+          <w:szCs w:val="27"/>
+          <w:lang w:val="en-GB"/>
+        </w:rPr>
+      </w:pPr>
+      <w:r>
+        <w:rPr>
+          <w:rFonts w:ascii="-webkit-standard" w:hAnsi="-webkit-standard" w:cs="-webkit-standard"/>
+          <w:color w:val="000000"/>
+          <w:sz w:val="27"/>
+          <w:szCs w:val="27"/>
+          <w:lang w:val="en-GB"/>
+        </w:rPr>
+        <w:t>Can we get the raw (RAW / unedited) files too?</w:t>
+      </w:r>
+      <w:r>
+        <w:rPr>
+          <w:rFonts w:ascii="-webkit-standard" w:hAnsi="-webkit-standard" w:cs="-webkit-standard"/>
+          <w:sz w:val="27"/>
+          <w:szCs w:val="27"/>
+          <w:lang w:val="en-GB"/>
+        </w:rPr>
+        <w:t> </w:t>
+      </w:r>
+    </w:p>
+    <w:p>
+      <w:pPr>
+        <w:pStyle w:val="Listaszerbekezds"/>
+        <w:numPr>
+          <w:ilvl w:val="2"/>
+          <w:numId w:val="2"/>
+        </w:numPr>
+        <w:rPr>
+          <w:rFonts w:ascii="Times New Roman" w:hAnsi="Times New Roman" w:cs="Times New Roman"/>
+          <w:color w:val="000000"/>
+          <w:sz w:val="20"/>
+          <w:szCs w:val="20"/>
+          <w:lang w:val="en-GB"/>
+        </w:rPr>
+      </w:pPr>
+      <w:r>
+        <w:rPr>
+          <w:rFonts w:ascii="Times New Roman" w:hAnsi="Times New Roman" w:cs="Times New Roman"/>
+          <w:color w:val="000000"/>
+          <w:sz w:val="20"/>
+          <w:szCs w:val="20"/>
+          <w:lang w:val="en-GB"/>
+        </w:rPr>
+        <w:t xml:space="preserve">No, I do not provide RAW or unedited photos under any circumstances. Taking the pictures is only half the work; the final </w:t>
+      </w:r>
+      <w:proofErr w:type="spellStart"/>
+      <w:r>
+        <w:rPr>
+          <w:rFonts w:ascii="Times New Roman" w:hAnsi="Times New Roman" w:cs="Times New Roman"/>
+          <w:color w:val="000000"/>
+          <w:sz w:val="20"/>
+          <w:szCs w:val="20"/>
+          <w:lang w:val="en-GB"/>
+        </w:rPr>
+        <w:t>color</w:t>
+      </w:r>
+      <w:proofErr w:type="spellEnd"/>
+      <w:r>
+        <w:rPr>
+          <w:rFonts w:ascii="Times New Roman" w:hAnsi="Times New Roman" w:cs="Times New Roman"/>
+          <w:color w:val="000000"/>
+          <w:sz w:val="20"/>
+          <w:szCs w:val="20"/>
+          <w:lang w:val="en-GB"/>
+        </w:rPr>
+        <w:t xml:space="preserve"> palette, mood, and style that characterize my work are achieved through careful post-processing (</w:t>
+      </w:r>
+      <w:proofErr w:type="spellStart"/>
+      <w:r>
+        <w:rPr>
+          <w:rFonts w:ascii="Times New Roman" w:hAnsi="Times New Roman" w:cs="Times New Roman"/>
+          <w:color w:val="000000"/>
+          <w:sz w:val="20"/>
+          <w:szCs w:val="20"/>
+          <w:lang w:val="en-GB"/>
+        </w:rPr>
+        <w:t>color</w:t>
+      </w:r>
+      <w:proofErr w:type="spellEnd"/>
+      <w:r>
+        <w:rPr>
+          <w:rFonts w:ascii="Times New Roman" w:hAnsi="Times New Roman" w:cs="Times New Roman"/>
+          <w:color w:val="000000"/>
+          <w:sz w:val="20"/>
+          <w:szCs w:val="20"/>
+          <w:lang w:val="en-GB"/>
+        </w:rPr>
+        <w:t xml:space="preserve"> grading, correction, and retouching). A raw file is like raw ingredients for a chef—only a maximum quality, fully "cooked" visual experience can be associated with my name and portfolio. I trust that you chose me precisely because of the style of my finished work!</w:t>
+      </w:r>
+    </w:p>
+    <w:p>
+      <w:pPr>
+        <w:pStyle w:val="Listaszerbekezds"/>
+        <w:numPr>
+          <w:ilvl w:val="1"/>
+          <w:numId w:val="2"/>
+        </w:numPr>
+        <w:rPr>
+          <w:rFonts w:ascii="-webkit-standard" w:hAnsi="-webkit-standard" w:cs="-webkit-standard"/>
+          <w:color w:val="000000"/>
+          <w:sz w:val="27"/>
+          <w:szCs w:val="27"/>
+          <w:lang w:val="en-GB"/>
+        </w:rPr>
+      </w:pPr>
+      <w:r>
+        <w:rPr>
+          <w:rFonts w:ascii="-webkit-standard" w:hAnsi="-webkit-standard" w:cs="-webkit-standard"/>
+          <w:color w:val="000000"/>
+          <w:sz w:val="27"/>
+          <w:szCs w:val="27"/>
+          <w:lang w:val="en-GB"/>
+        </w:rPr>
+        <w:t>In what format will we receive the photos?</w:t>
+      </w:r>
+      <w:r>
+        <w:rPr>
+          <w:rFonts w:ascii="-webkit-standard" w:hAnsi="-webkit-standard" w:cs="-webkit-standard"/>
+          <w:sz w:val="27"/>
+          <w:szCs w:val="27"/>
+          <w:lang w:val="en-GB"/>
+        </w:rPr>
+        <w:t> </w:t>
+      </w:r>
+    </w:p>
+    <w:p>
+      <w:pPr>
+        <w:pStyle w:val="Listaszerbekezds"/>
+        <w:numPr>
+          <w:ilvl w:val="2"/>
+          <w:numId w:val="2"/>
+        </w:numPr>
+        <w:rPr>
+          <w:rFonts w:ascii="Times New Roman" w:hAnsi="Times New Roman" w:cs="Times New Roman"/>
+          <w:color w:val="000000"/>
+          <w:sz w:val="20"/>
+          <w:szCs w:val="20"/>
+          <w:lang w:val="en-GB"/>
+        </w:rPr>
+      </w:pPr>
+      <w:r>
+        <w:rPr>
+          <w:rFonts w:ascii="Times New Roman" w:hAnsi="Times New Roman" w:cs="Times New Roman"/>
+          <w:color w:val="000000"/>
+          <w:sz w:val="20"/>
+          <w:szCs w:val="20"/>
+          <w:lang w:val="en-GB"/>
+        </w:rPr>
+        <w:t>The final, edited photos will be delivered in high-resolution, print-quality, watermark-free JPEG format. I will create an elegant, private online gallery for you to access the images. You can easily share this link with family and friends, and conveniently download the photos to your computer or phone without any loss in quality (unlike sending them via Messenger or Facebook).</w:t>
+      </w:r>
+    </w:p>
+    <w:p>
+      <w:pPr>
+        <w:pStyle w:val="Listaszerbekezds"/>
+        <w:numPr>
+          <w:ilvl w:val="0"/>
+          <w:numId w:val="2"/>
+        </w:numPr>
+        <w:rPr>
+          <w:rFonts w:ascii="Times New Roman" w:hAnsi="Times New Roman" w:cs="Times New Roman"/>
+          <w:color w:val="000000"/>
+          <w:sz w:val="30"/>
+          <w:szCs w:val="30"/>
+          <w:lang w:val="en-GB"/>
+        </w:rPr>
+      </w:pPr>
+      <w:r>
+        <w:rPr>
+          <w:rFonts w:ascii="Times New Roman" w:hAnsi="Times New Roman" w:cs="Times New Roman"/>
+          <w:color w:val="000000"/>
+          <w:sz w:val="30"/>
+          <w:szCs w:val="30"/>
+          <w:lang w:val="en-GB"/>
+        </w:rPr>
+        <w:t>Locations &amp; Travel</w:t>
+      </w:r>
+    </w:p>
+    <w:p>
+      <w:pPr>
+        <w:pStyle w:val="Listaszerbekezds"/>
+        <w:numPr>
+          <w:ilvl w:val="1"/>
+          <w:numId w:val="2"/>
+        </w:numPr>
+        <w:rPr>
+          <w:rFonts w:ascii="-webkit-standard" w:hAnsi="-webkit-standard" w:cs="-webkit-standard"/>
+          <w:sz w:val="27"/>
+          <w:szCs w:val="27"/>
+          <w:lang w:val="en-GB"/>
+        </w:rPr>
+      </w:pPr>
+      <w:r>
+        <w:rPr>
+          <w:rFonts w:ascii="-webkit-standard" w:hAnsi="-webkit-standard" w:cs="-webkit-standard"/>
+          <w:color w:val="000000"/>
+          <w:sz w:val="27"/>
+          <w:szCs w:val="27"/>
+          <w:lang w:val="en-GB"/>
+        </w:rPr>
+        <w:t>Do you travel to other towns or abroad?</w:t>
+      </w:r>
+      <w:r>
+        <w:rPr>
+          <w:rFonts w:ascii="-webkit-standard" w:hAnsi="-webkit-standard" w:cs="-webkit-standard"/>
+          <w:sz w:val="27"/>
+          <w:szCs w:val="27"/>
+          <w:lang w:val="en-GB"/>
+        </w:rPr>
+        <w:t> </w:t>
+      </w:r>
+    </w:p>
+    <w:p>
+      <w:pPr>
+        <w:pStyle w:val="Listaszerbekezds"/>
+        <w:numPr>
+          <w:ilvl w:val="2"/>
+          <w:numId w:val="2"/>
+        </w:numPr>
+        <w:rPr>
+          <w:rFonts w:ascii="Times New Roman" w:hAnsi="Times New Roman" w:cs="Times New Roman"/>
+          <w:color w:val="000000"/>
+          <w:sz w:val="20"/>
+          <w:szCs w:val="20"/>
+          <w:lang w:val="en-GB"/>
+        </w:rPr>
+      </w:pPr>
+      <w:r>
+        <w:rPr>
+          <w:rFonts w:ascii="Times New Roman" w:hAnsi="Times New Roman" w:cs="Times New Roman"/>
+          <w:color w:val="000000"/>
+          <w:sz w:val="20"/>
+          <w:szCs w:val="20"/>
+          <w:lang w:val="en-GB"/>
+        </w:rPr>
+        <w:t xml:space="preserve">Absolutely, and I especially love discovering new locations and exciting environments! Although my base is in Budapest, I am more than happy to travel </w:t>
+      </w:r>
+      <w:r>
+        <w:rPr>
+          <w:rFonts w:ascii="Times New Roman" w:hAnsi="Times New Roman" w:cs="Times New Roman"/>
+          <w:color w:val="000000"/>
+          <w:sz w:val="20"/>
+          <w:szCs w:val="20"/>
+          <w:lang w:val="en-GB"/>
+        </w:rPr>
+        <w:lastRenderedPageBreak/>
+        <w:t>anywhere in the country or even to international destinations, whether it's for a wedding, a sporting event, or a special portrait session.</w:t>
+      </w:r>
+    </w:p>
+    <w:p>
+      <w:pPr>
+        <w:pStyle w:val="Listaszerbekezds"/>
+        <w:numPr>
+          <w:ilvl w:val="1"/>
+          <w:numId w:val="2"/>
+        </w:numPr>
+        <w:rPr>
+          <w:rFonts w:ascii="-webkit-standard" w:hAnsi="-webkit-standard" w:cs="-webkit-standard"/>
+          <w:sz w:val="27"/>
+          <w:szCs w:val="27"/>
+          <w:lang w:val="en-GB"/>
+        </w:rPr>
+      </w:pPr>
+      <w:r>
+        <w:rPr>
+          <w:rFonts w:ascii="-webkit-standard" w:hAnsi="-webkit-standard" w:cs="-webkit-standard"/>
+          <w:color w:val="000000"/>
+          <w:sz w:val="27"/>
+          <w:szCs w:val="27"/>
+          <w:lang w:val="en-GB"/>
+        </w:rPr>
+        <w:t>What are the travel and accommodation costs?</w:t>
+      </w:r>
+      <w:r>
+        <w:rPr>
+          <w:rFonts w:ascii="-webkit-standard" w:hAnsi="-webkit-standard" w:cs="-webkit-standard"/>
+          <w:sz w:val="27"/>
+          <w:szCs w:val="27"/>
+          <w:lang w:val="en-GB"/>
+        </w:rPr>
+        <w:t> </w:t>
+      </w:r>
+    </w:p>
+    <w:p>
+      <w:pPr>
+        <w:pStyle w:val="Listaszerbekezds"/>
+        <w:numPr>
+          <w:ilvl w:val="2"/>
+          <w:numId w:val="2"/>
+        </w:numPr>
+        <w:rPr>
+          <w:rFonts w:ascii="Times New Roman" w:hAnsi="Times New Roman" w:cs="Times New Roman"/>
+          <w:color w:val="000000"/>
+          <w:sz w:val="20"/>
+          <w:szCs w:val="20"/>
+          <w:lang w:val="en-GB"/>
+        </w:rPr>
+      </w:pPr>
+      <w:r>
+        <w:rPr>
+          <w:rFonts w:ascii="Times New Roman" w:hAnsi="Times New Roman" w:cs="Times New Roman"/>
+          <w:color w:val="000000"/>
+          <w:sz w:val="20"/>
+          <w:szCs w:val="20"/>
+          <w:lang w:val="en-GB"/>
+        </w:rPr>
+        <w:t>Every quote is custom, and travel fees are agreed upon transparently in advance based on the location of the photoshoot. Within the immediate vicinity of Szarvas, travel is generally free of charge. For further locations, a fair, mileage-based travel fee will apply. Accommodation costs only arise in exceptional cases, such as when the venue is very far away and the shoot (e.g., a wedding) extends late into the night or early morning, or if it is a multi-day event.</w:t>
+      </w:r>
+    </w:p>
+    <w:p>
+      <w:pPr>
+        <w:pStyle w:val="Listaszerbekezds"/>
+        <w:numPr>
+          <w:ilvl w:val="1"/>
+          <w:numId w:val="2"/>
+        </w:numPr>
+        <w:rPr>
+          <w:rFonts w:ascii="-webkit-standard" w:hAnsi="-webkit-standard" w:cs="-webkit-standard"/>
+          <w:sz w:val="27"/>
+          <w:szCs w:val="27"/>
+          <w:lang w:val="en-GB"/>
+        </w:rPr>
+      </w:pPr>
+      <w:r>
+        <w:rPr>
+          <w:rFonts w:ascii="-webkit-standard" w:hAnsi="-webkit-standard" w:cs="-webkit-standard"/>
+          <w:color w:val="000000"/>
+          <w:sz w:val="27"/>
+          <w:szCs w:val="27"/>
+          <w:lang w:val="en-GB"/>
+        </w:rPr>
+        <w:t>Do you help choose the right photoshoot location or studio?</w:t>
+      </w:r>
+      <w:r>
+        <w:rPr>
+          <w:rFonts w:ascii="-webkit-standard" w:hAnsi="-webkit-standard" w:cs="-webkit-standard"/>
+          <w:sz w:val="27"/>
+          <w:szCs w:val="27"/>
+          <w:lang w:val="en-GB"/>
+        </w:rPr>
+        <w:t> </w:t>
+      </w:r>
+    </w:p>
+    <w:p>
+      <w:pPr>
+        <w:pStyle w:val="Listaszerbekezds"/>
+        <w:numPr>
+          <w:ilvl w:val="2"/>
+          <w:numId w:val="2"/>
+        </w:numPr>
+        <w:rPr>
+          <w:rFonts w:ascii="Times New Roman" w:hAnsi="Times New Roman" w:cs="Times New Roman"/>
+          <w:color w:val="000000"/>
+          <w:sz w:val="20"/>
+          <w:szCs w:val="20"/>
+          <w:lang w:val="en-GB"/>
+        </w:rPr>
+      </w:pPr>
+      <w:r>
+        <w:rPr>
+          <w:rFonts w:ascii="Times New Roman" w:hAnsi="Times New Roman" w:cs="Times New Roman"/>
+          <w:color w:val="000000"/>
+          <w:sz w:val="20"/>
+          <w:szCs w:val="20"/>
+          <w:lang w:val="en-GB"/>
+        </w:rPr>
+        <w:t>With great pleasure! Over the years, I have discovered many wonderful outdoor spots and beautiful, professional daylight studios. Once we discuss the exact mood you want for the photos (e.g., clean and elegant, romantic and close to nature, or modern industrial), I will suggest several specific options with sample images, and we can choose the most ideal one together.</w:t>
+      </w:r>
+    </w:p>
+    <w:p>
+      <w:pPr>
+        <w:pStyle w:val="Listaszerbekezds"/>
+        <w:numPr>
+          <w:ilvl w:val="1"/>
+          <w:numId w:val="2"/>
+        </w:numPr>
+        <w:rPr>
+          <w:rFonts w:ascii="-webkit-standard" w:hAnsi="-webkit-standard" w:cs="-webkit-standard"/>
+          <w:sz w:val="27"/>
+          <w:szCs w:val="27"/>
+          <w:lang w:val="en-GB"/>
+        </w:rPr>
+      </w:pPr>
+      <w:r>
+        <w:rPr>
+          <w:rFonts w:ascii="-webkit-standard" w:hAnsi="-webkit-standard" w:cs="-webkit-standard"/>
+          <w:color w:val="000000"/>
+          <w:sz w:val="27"/>
+          <w:szCs w:val="27"/>
+          <w:lang w:val="en-GB"/>
+        </w:rPr>
+        <w:t>Is the studio rental fee included in the price?</w:t>
+      </w:r>
+      <w:r>
+        <w:rPr>
+          <w:rFonts w:ascii="-webkit-standard" w:hAnsi="-webkit-standard" w:cs="-webkit-standard"/>
+          <w:sz w:val="27"/>
+          <w:szCs w:val="27"/>
+          <w:lang w:val="en-GB"/>
+        </w:rPr>
+        <w:t> </w:t>
+      </w:r>
+    </w:p>
+    <w:p>
+      <w:pPr>
+        <w:pStyle w:val="Listaszerbekezds"/>
+        <w:numPr>
+          <w:ilvl w:val="2"/>
+          <w:numId w:val="2"/>
+        </w:numPr>
+        <w:rPr>
+          <w:rFonts w:ascii="Times New Roman" w:hAnsi="Times New Roman" w:cs="Times New Roman"/>
+          <w:color w:val="000000"/>
+          <w:sz w:val="20"/>
+          <w:szCs w:val="20"/>
+          <w:lang w:val="en-GB"/>
+        </w:rPr>
+      </w:pPr>
+      <w:r>
+        <w:rPr>
+          <w:rFonts w:ascii="Times New Roman" w:hAnsi="Times New Roman" w:cs="Times New Roman"/>
+          <w:color w:val="000000"/>
+          <w:sz w:val="20"/>
+          <w:szCs w:val="20"/>
+          <w:lang w:val="en-GB"/>
+        </w:rPr>
+        <w:t>By default, my photography packages do not include studio rental fees, as prices, sizes, and conditions vary greatly between studios (typically ranging from 8,000 to 15,000 HUF / hour). Once we have jointly selected your preferred studio, the rental fee will be charged separately. However, I will fully handle the booking administration and communication with the studio, so you won't have to worry about a thing!</w:t>
       </w:r>
     </w:p>
     <w:sectPr>
@@ -1135,6 +2410,96 @@
 <file path=word/numbering.xml><?xml version="1.0" encoding="utf-8"?>
 <w:numbering xmlns:wpc="http://schemas.microsoft.com/office/word/2010/wordprocessingCanvas" xmlns:cx="http://schemas.microsoft.com/office/drawing/2014/chartex" xmlns:cx1="http://schemas.microsoft.com/office/drawing/2015/9/8/chartex" xmlns:cx2="http://schemas.microsoft.com/office/drawing/2015/10/21/chartex" xmlns:cx3="http://schemas.microsoft.com/office/drawing/2016/5/9/chartex" xmlns:cx4="http://schemas.microsoft.com/office/drawing/2016/5/10/chartex" xmlns:cx5="http://schemas.microsoft.com/office/drawing/2016/5/11/chartex" xmlns:cx6="http://schemas.microsoft.com/office/drawing/2016/5/12/chartex" xmlns:cx7="http://schemas.microsoft.com/office/drawing/2016/5/13/chartex" xmlns:cx8="http://schemas.microsoft.com/office/drawing/2016/5/14/chartex" xmlns:mc="http://schemas.openxmlformats.org/markup-compatibility/2006" xmlns:m="http://schemas.openxmlformats.org/officeDocument/2006/math" xmlns:aink="http://schemas.microsoft.com/office/drawing/2016/ink" xmlns:am3d="http://schemas.microsoft.com/office/drawing/2017/model3d" xmlns:oel="http://schemas.microsoft.com/office/2019/extlst" xmlns:r="http://schemas.openxmlformats.org/officeDocument/2006/relationships" xmlns:wp14="http://schemas.microsoft.com/office/word/2010/wordprocessingDrawing" xmlns:wp="http://schemas.openxmlformats.org/drawingml/2006/wordprocessingDrawing" xmlns:wpg="http://schemas.microsoft.com/office/word/2010/wordprocessingGroup" xmlns:wpi="http://schemas.microsoft.com/office/word/2010/wordprocessingInk" xmlns:wps="http://schemas.microsoft.com/office/word/2010/wordprocessingShape" xmlns:o="urn:schemas-microsoft-com:office:office" xmlns:v="urn:schemas-microsoft-com:vml" xmlns:w10="urn:schemas-microsoft-com:office:word" xmlns:w="http://schemas.openxmlformats.org/wordprocessingml/2006/main" xmlns:w14="http://schemas.microsoft.com/office/word/2010/wordml" xmlns:w15="http://schemas.microsoft.com/office/word/2012/wordml" xmlns:w16cex="http://schemas.microsoft.com/office/word/2018/wordml/cex" xmlns:w16cid="http://schemas.microsoft.com/office/word/2016/wordml/cid" xmlns:w16="http://schemas.microsoft.com/office/word/2018/wordml" xmlns:w16sdtdh="http://schemas.microsoft.com/office/word/2020/wordml/sdtdatahash" xmlns:w16sdtfl="http://schemas.microsoft.com/office/word/2024/wordml/sdtformatlock" xmlns:w16se="http://schemas.microsoft.com/office/word/2015/wordml/symex" xmlns:w16du="http://schemas.microsoft.com/office/word/2023/wordml/word16du" xmlns:wne="http://schemas.microsoft.com/office/word/2006/wordml" mc:Ignorable="w14 w15 w16se w16cid w16 w16cex w16sdtdh w16sdtfl w16du wp14">
   <w:abstractNum w:abstractNumId="0" w15:restartNumberingAfterBreak="0">
+    <w:nsid w:val="12D40D47"/>
+    <w:multiLevelType w:val="hybridMultilevel"/>
+    <w:tmpl w:val="D4241DE2"/>
+    <w:lvl w:ilvl="0" w:tplc="F0C2DB76">
+      <w:start w:val="1"/>
+      <w:numFmt w:val="decimal"/>
+      <w:lvlText w:val="%1."/>
+      <w:lvlJc w:val="left"/>
+      <w:pPr>
+        <w:ind w:left="1080" w:hanging="360"/>
+      </w:pPr>
+      <w:rPr>
+        <w:rFonts w:hint="default"/>
+        <w:color w:val="000000"/>
+      </w:rPr>
+    </w:lvl>
+    <w:lvl w:ilvl="1" w:tplc="040E0019">
+      <w:start w:val="1"/>
+      <w:numFmt w:val="lowerLetter"/>
+      <w:lvlText w:val="%2."/>
+      <w:lvlJc w:val="left"/>
+      <w:pPr>
+        <w:ind w:left="1800" w:hanging="360"/>
+      </w:pPr>
+    </w:lvl>
+    <w:lvl w:ilvl="2" w:tplc="040E001B">
+      <w:start w:val="1"/>
+      <w:numFmt w:val="lowerRoman"/>
+      <w:lvlText w:val="%3."/>
+      <w:lvlJc w:val="right"/>
+      <w:pPr>
+        <w:ind w:left="2520" w:hanging="180"/>
+      </w:pPr>
+    </w:lvl>
+    <w:lvl w:ilvl="3" w:tplc="040E000F">
+      <w:start w:val="1"/>
+      <w:numFmt w:val="decimal"/>
+      <w:lvlText w:val="%4."/>
+      <w:lvlJc w:val="left"/>
+      <w:pPr>
+        <w:ind w:left="3240" w:hanging="360"/>
+      </w:pPr>
+    </w:lvl>
+    <w:lvl w:ilvl="4" w:tplc="040E0019" w:tentative="1">
+      <w:start w:val="1"/>
+      <w:numFmt w:val="lowerLetter"/>
+      <w:lvlText w:val="%5."/>
+      <w:lvlJc w:val="left"/>
+      <w:pPr>
+        <w:ind w:left="3960" w:hanging="360"/>
+      </w:pPr>
+    </w:lvl>
+    <w:lvl w:ilvl="5" w:tplc="040E001B" w:tentative="1">
+      <w:start w:val="1"/>
+      <w:numFmt w:val="lowerRoman"/>
+      <w:lvlText w:val="%6."/>
+      <w:lvlJc w:val="right"/>
+      <w:pPr>
+        <w:ind w:left="4680" w:hanging="180"/>
+      </w:pPr>
+    </w:lvl>
+    <w:lvl w:ilvl="6" w:tplc="040E000F" w:tentative="1">
+      <w:start w:val="1"/>
+      <w:numFmt w:val="decimal"/>
+      <w:lvlText w:val="%7."/>
+      <w:lvlJc w:val="left"/>
+      <w:pPr>
+        <w:ind w:left="5400" w:hanging="360"/>
+      </w:pPr>
+    </w:lvl>
+    <w:lvl w:ilvl="7" w:tplc="040E0019" w:tentative="1">
+      <w:start w:val="1"/>
+      <w:numFmt w:val="lowerLetter"/>
+      <w:lvlText w:val="%8."/>
+      <w:lvlJc w:val="left"/>
+      <w:pPr>
+        <w:ind w:left="6120" w:hanging="360"/>
+      </w:pPr>
+    </w:lvl>
+    <w:lvl w:ilvl="8" w:tplc="040E001B" w:tentative="1">
+      <w:start w:val="1"/>
+      <w:numFmt w:val="lowerRoman"/>
+      <w:lvlText w:val="%9."/>
+      <w:lvlJc w:val="right"/>
+      <w:pPr>
+        <w:ind w:left="6840" w:hanging="180"/>
+      </w:pPr>
+    </w:lvl>
+  </w:abstractNum>
+  <w:abstractNum w:abstractNumId="1" w15:restartNumberingAfterBreak="0">
     <w:nsid w:val="591E1814"/>
     <w:multiLevelType w:val="hybridMultilevel"/>
     <w:tmpl w:val="EA30B996"/>
@@ -1221,6 +2586,9 @@
     </w:lvl>
   </w:abstractNum>
   <w:num w:numId="1" w16cid:durableId="73866884">
+    <w:abstractNumId w:val="1"/>
+  </w:num>
+  <w:num w:numId="2" w16cid:durableId="307252475">
     <w:abstractNumId w:val="0"/>
   </w:num>
 </w:numbering>
@@ -2148,6 +3516,22 @@
     <w:basedOn w:val="Bekezdsalapbettpusa"/>
     <w:rsid w:val="00344D89"/>
   </w:style>
+  <w:style w:type="paragraph" w:styleId="NormlWeb">
+    <w:name w:val="Normal (Web)"/>
+    <w:basedOn w:val="Norml"/>
+    <w:uiPriority w:val="99"/>
+    <w:unhideWhenUsed/>
+    <w:rsid w:val="006A38B1"/>
+    <w:pPr>
+      <w:spacing w:before="100" w:beforeAutospacing="1" w:after="100" w:afterAutospacing="1" w:line="240" w:lineRule="auto"/>
+    </w:pPr>
+    <w:rPr>
+      <w:rFonts w:ascii="Times New Roman" w:eastAsia="Times New Roman" w:hAnsi="Times New Roman" w:cs="Times New Roman"/>
+      <w:kern w:val="0"/>
+      <w:lang w:eastAsia="hu-HU"/>
+      <w14:ligatures w14:val="none"/>
+    </w:rPr>
+  </w:style>
 </w:styles>
 </file>
 

</xml_diff>